<commit_message>
Viết lại phần Nhu cầu bài Coolmate: nêu rõ nhu cầu, đối tượng, quy mô, tần suất, khả năng chi trả
Co-Authored-By: Claude Opus 5.5 <noreply@anthropic.com>
Claude-Session: https://claude.ai/code/session_01MCvVHVVZN1Y5TfVdF6k7D1
</commit_message>
<xml_diff>
--- a/VEM/Phan_tich_VEM_Coolmate_theo_mau_MoMo3.docx
+++ b/VEM/Phan_tich_VEM_Coolmate_theo_mau_MoMo3.docx
@@ -1113,7 +1113,7 @@
         <w:rPr>
           <w:i/>
         </w:rPr>
-        <w:t>Vào thời điểm Coolmate ra đời (2019), người tiêu dùng – đặc biệt là nam giới – có nhu cầu gì khi mua trang phục? Có dữ liệu khảo sát và thị trường nào chứng minh nhu cầu đó lớn và cấp thiết?</w:t>
+        <w:t>Năm 2019, khi Coolmate ra đời, khách hàng thực sự cần gì? Ai có nhu cầu, nhu cầu lớn đến đâu, có cấp thiết không và họ sẵn sàng trả bao nhiêu?</w:t>
       </w:r>
     </w:p>
     <w:p>
@@ -1124,7 +1124,7 @@
         <w:rPr>
           <w:i/>
         </w:rPr>
-        <w:t>Lưu ý về phạm vi: phần này phân tích nhu cầu ở giai đoạn khởi nghiệp của Coolmate (khoảng 2017–2019), dựa trên các khảo sát người tiêu dùng và số liệu thị trường được công bố. Dữ liệu các năm sau chỉ dùng để kiểm chứng.</w:t>
+        <w:t>Lưu ý về phạm vi: phần này phân tích nhu cầu ở giai đoạn khởi nghiệp của Coolmate (khoảng 2017–2019). Dữ liệu các năm sau chỉ dùng để kiểm chứng.</w:t>
       </w:r>
     </w:p>
     <w:p>
@@ -1135,7 +1135,7 @@
         <w:rPr>
           <w:i w:val="0"/>
         </w:rPr>
-        <w:t>a) Dữ liệu khảo sát: thời trang là nhu cầu mua sắm trực tuyến hàng đầu</w:t>
+        <w:t>a) Nhu cầu cụ thể là gì?</w:t>
       </w:r>
     </w:p>
     <w:p>
@@ -1146,9 +1146,248 @@
         <w:rPr>
           <w:i w:val="0"/>
         </w:rPr>
-        <w:t>Khảo sát của Q&amp;Me năm 2017 với 512 người từ 18–39 tuổi cho thấy gần một nửa người được hỏi chi dưới 300.000 đồng mỗi tháng cho thời trang (Q&amp;Me, 2017a). Một khảo sát khác của Q&amp;Me cùng năm với 323 người ghi nhận 58% chi dưới 500.000 đồng mỗi tháng cho thời trang (Q&amp;Me, 2017b). Hai kết quả cho thấy người tiêu dùng Việt có nhu cầu mua thời trang thường xuyên nhưng ngân sách hạn chế – tức là cần sản phẩm giá phổ thông.</w:t>
+        <w:t>Có thể phát biểu ngắn gọn nhu cầu mà Coolmate nhắm tới như sau: nam giới trẻ ở đô thị cần mua những món đồ mặc hằng ngày (áo thun, quần lót, tất, quần short) có chất lượng ổn định, giá vừa túi tiền, mua nhanh qua điện thoại và không sợ mua sai. Nhu cầu này gồm bốn ý cụ thể:</w:t>
       </w:r>
     </w:p>
+    <w:p>
+      <w:pPr>
+        <w:jc w:val="center"/>
+      </w:pPr>
+      <w:r>
+        <w:rPr>
+          <w:b/>
+          <w:i/>
+        </w:rPr>
+        <w:t>Bảng 4. Bốn nhu cầu cụ thể của khách hàng</w:t>
+      </w:r>
+    </w:p>
+    <w:tbl>
+      <w:tblPr>
+        <w:tblStyle w:val="TableGrid"/>
+        <w:tblW w:type="auto" w:w="0"/>
+        <w:tblLook w:firstColumn="1" w:firstRow="1" w:lastColumn="0" w:lastRow="0" w:noHBand="0" w:noVBand="1" w:val="04A0"/>
+      </w:tblPr>
+      <w:tblGrid>
+        <w:gridCol w:w="2880"/>
+        <w:gridCol w:w="2880"/>
+        <w:gridCol w:w="2880"/>
+      </w:tblGrid>
+      <w:tr>
+        <w:tc>
+          <w:tcPr>
+            <w:tcW w:type="dxa" w:w="2880"/>
+            <w:shd w:val="clear" w:fill="1F3A60"/>
+          </w:tcPr>
+          <w:p>
+            <w:r>
+              <w:rPr>
+                <w:b/>
+                <w:color w:val="FFFFFF"/>
+                <w:sz w:val="23"/>
+              </w:rPr>
+              <w:t>Nhu cầu cụ thể</w:t>
+            </w:r>
+          </w:p>
+        </w:tc>
+        <w:tc>
+          <w:tcPr>
+            <w:tcW w:type="dxa" w:w="2880"/>
+            <w:shd w:val="clear" w:fill="1F3A60"/>
+          </w:tcPr>
+          <w:p>
+            <w:r>
+              <w:rPr>
+                <w:b/>
+                <w:color w:val="FFFFFF"/>
+                <w:sz w:val="23"/>
+              </w:rPr>
+              <w:t>Khách hàng muốn</w:t>
+            </w:r>
+          </w:p>
+        </w:tc>
+        <w:tc>
+          <w:tcPr>
+            <w:tcW w:type="dxa" w:w="2880"/>
+            <w:shd w:val="clear" w:fill="1F3A60"/>
+          </w:tcPr>
+          <w:p>
+            <w:r>
+              <w:rPr>
+                <w:b/>
+                <w:color w:val="FFFFFF"/>
+                <w:sz w:val="23"/>
+              </w:rPr>
+              <w:t>Bằng chứng từ khảo sát, thị trường</w:t>
+            </w:r>
+          </w:p>
+        </w:tc>
+      </w:tr>
+      <w:tr>
+        <w:tc>
+          <w:tcPr>
+            <w:tcW w:type="dxa" w:w="2880"/>
+          </w:tcPr>
+          <w:p>
+            <w:r>
+              <w:rPr>
+                <w:sz w:val="23"/>
+              </w:rPr>
+              <w:t>1. Giá vừa túi tiền</w:t>
+            </w:r>
+          </w:p>
+        </w:tc>
+        <w:tc>
+          <w:tcPr>
+            <w:tcW w:type="dxa" w:w="2880"/>
+          </w:tcPr>
+          <w:p>
+            <w:r>
+              <w:rPr>
+                <w:sz w:val="23"/>
+              </w:rPr>
+              <w:t>Đồ cơ bản giá phổ thông, không phải trả giá cao cho thương hiệu ngoại</w:t>
+            </w:r>
+          </w:p>
+        </w:tc>
+        <w:tc>
+          <w:tcPr>
+            <w:tcW w:type="dxa" w:w="2880"/>
+          </w:tcPr>
+          <w:p>
+            <w:r>
+              <w:rPr>
+                <w:sz w:val="23"/>
+              </w:rPr>
+              <w:t>Gần 50% người 18–39 tuổi chi dưới 300.000 đồng/tháng cho thời trang (Q&amp;Me, 2017a); 58% chi dưới 500.000 đồng/tháng (Q&amp;Me, 2017b)</w:t>
+            </w:r>
+          </w:p>
+        </w:tc>
+      </w:tr>
+      <w:tr>
+        <w:tc>
+          <w:tcPr>
+            <w:tcW w:type="dxa" w:w="2880"/>
+          </w:tcPr>
+          <w:p>
+            <w:r>
+              <w:rPr>
+                <w:sz w:val="23"/>
+              </w:rPr>
+              <w:t>2. Chất lượng đáng tin</w:t>
+            </w:r>
+          </w:p>
+        </w:tc>
+        <w:tc>
+          <w:tcPr>
+            <w:tcW w:type="dxa" w:w="2880"/>
+          </w:tcPr>
+          <w:p>
+            <w:r>
+              <w:rPr>
+                <w:sz w:val="23"/>
+              </w:rPr>
+              <w:t>Mua đúng hàng thật, đúng mô tả, mặc bền</w:t>
+            </w:r>
+          </w:p>
+        </w:tc>
+        <w:tc>
+          <w:tcPr>
+            <w:tcW w:type="dxa" w:w="2880"/>
+          </w:tcPr>
+          <w:p>
+            <w:r>
+              <w:rPr>
+                <w:sz w:val="23"/>
+              </w:rPr>
+              <w:t>Lo ngại hàng giả, hàng không giống mô tả là rào cản lớn nhất khi mua trực tuyến (Brands Vietnam, 2018)</w:t>
+            </w:r>
+          </w:p>
+        </w:tc>
+      </w:tr>
+      <w:tr>
+        <w:tc>
+          <w:tcPr>
+            <w:tcW w:type="dxa" w:w="2880"/>
+          </w:tcPr>
+          <w:p>
+            <w:r>
+              <w:rPr>
+                <w:sz w:val="23"/>
+              </w:rPr>
+              <w:t>3. Không sợ mua sai</w:t>
+            </w:r>
+          </w:p>
+        </w:tc>
+        <w:tc>
+          <w:tcPr>
+            <w:tcW w:type="dxa" w:w="2880"/>
+          </w:tcPr>
+          <w:p>
+            <w:r>
+              <w:rPr>
+                <w:sz w:val="23"/>
+              </w:rPr>
+              <w:t>Được đổi trả dễ dàng khi không vừa</w:t>
+            </w:r>
+          </w:p>
+        </w:tc>
+        <w:tc>
+          <w:tcPr>
+            <w:tcW w:type="dxa" w:w="2880"/>
+          </w:tcPr>
+          <w:p>
+            <w:r>
+              <w:rPr>
+                <w:sz w:val="23"/>
+              </w:rPr>
+              <w:t>Người mua muốn chạm, thử sản phẩm trước khi mua (Brands Vietnam, 2018)</w:t>
+            </w:r>
+          </w:p>
+        </w:tc>
+      </w:tr>
+      <w:tr>
+        <w:tc>
+          <w:tcPr>
+            <w:tcW w:type="dxa" w:w="2880"/>
+          </w:tcPr>
+          <w:p>
+            <w:r>
+              <w:rPr>
+                <w:sz w:val="23"/>
+              </w:rPr>
+              <w:t>4. Mua nhanh, tiện</w:t>
+            </w:r>
+          </w:p>
+        </w:tc>
+        <w:tc>
+          <w:tcPr>
+            <w:tcW w:type="dxa" w:w="2880"/>
+          </w:tcPr>
+          <w:p>
+            <w:r>
+              <w:rPr>
+                <w:sz w:val="23"/>
+              </w:rPr>
+              <w:t>Đặt hàng qua mạng, giao tận nơi, không mất thời gian đi chợ, đi cửa hàng</w:t>
+            </w:r>
+          </w:p>
+        </w:tc>
+        <w:tc>
+          <w:tcPr>
+            <w:tcW w:type="dxa" w:w="2880"/>
+          </w:tcPr>
+          <w:p>
+            <w:r>
+              <w:rPr>
+                <w:sz w:val="23"/>
+              </w:rPr>
+              <w:t>77% người dùng Internet đã từng mua hàng trực tuyến năm 2019 (Tuổi Trẻ, 2020)</w:t>
+            </w:r>
+          </w:p>
+        </w:tc>
+      </w:tr>
+    </w:tbl>
+    <w:p/>
     <w:p>
       <w:r>
         <w:rPr>
@@ -1170,14 +1409,13 @@
       </w:r>
     </w:p>
     <w:p>
-      <w:pPr>
-        <w:jc w:val="both"/>
-      </w:pPr>
       <w:r>
         <w:rPr>
-          <w:i w:val="0"/>
+          <w:i/>
+          <w:color w:val="555555"/>
+          <w:sz w:val="21"/>
         </w:rPr>
-        <w:t>Về hành vi mua sắm trực tuyến, khảo sát của Bộ Công Thương năm 2019 cho thấy 77% người dùng Internet tại Việt Nam đã từng mua hàng trực tuyến, đa số ở độ tuổi 18–25 (Tuổi Trẻ, 2020). Nghiên cứu của Nielsen cho biết khoảng 60% người mua sắm trực tuyến là nữ và 40% là nam; rào cản lớn nhất là lo ngại hàng giả, sản phẩm không giống mô tả và muốn được chạm, thử trước khi mua (Brands Vietnam, 2018).</w:t>
+        <w:t>Nguồn: Brands Vietnam. (2018). Nielsen: Thương mại điện tử Việt Nam có thể đạt 10 tỷ USD. https://www.brandsvietnam.com/17321-Nielsen-Thuong-mai-dien-tu-Viet-Nam-co-the-dat-10-ty-USD</w:t>
       </w:r>
     </w:p>
     <w:p>
@@ -1191,6 +1429,83 @@
       </w:r>
     </w:p>
     <w:p>
+      <w:pPr>
+        <w:jc w:val="both"/>
+      </w:pPr>
+      <w:r>
+        <w:rPr>
+          <w:i w:val="0"/>
+        </w:rPr>
+        <w:t>b) Ai có nhu cầu?</w:t>
+      </w:r>
+    </w:p>
+    <w:p>
+      <w:pPr>
+        <w:jc w:val="both"/>
+      </w:pPr>
+      <w:r>
+        <w:rPr>
+          <w:i w:val="0"/>
+        </w:rPr>
+        <w:t>Khách hàng mục tiêu là nam giới khoảng 18–35 tuổi, sống ở đô thị, đã quen mua sắm trực tuyến. Lý do chọn nhóm này:</w:t>
+      </w:r>
+    </w:p>
+    <w:p>
+      <w:pPr>
+        <w:pStyle w:val="ListBullet"/>
+        <w:jc w:val="both"/>
+      </w:pPr>
+      <w:r>
+        <w:rPr>
+          <w:b/>
+        </w:rPr>
+        <w:t xml:space="preserve">Trẻ và quen mua qua mạng: </w:t>
+      </w:r>
+      <w:r>
+        <w:t>đa số người mua sắm trực tuyến năm 2019 ở độ tuổi 18–25 (Tuổi Trẻ, 2020).</w:t>
+      </w:r>
+    </w:p>
+    <w:p>
+      <w:pPr>
+        <w:pStyle w:val="ListBullet"/>
+        <w:jc w:val="both"/>
+      </w:pPr>
+      <w:r>
+        <w:rPr>
+          <w:b/>
+        </w:rPr>
+        <w:t xml:space="preserve">Bị các thương hiệu “bỏ quên”: </w:t>
+      </w:r>
+      <w:r>
+        <w:t>nam giới chiếm khoảng 40% người mua sắm trực tuyến (Brands Vietnam, 2018), nhưng các thương hiệu thời trang chủ yếu chăm chút cho khách nữ, nên nhu cầu của khách nam ít được đáp ứng tốt.</w:t>
+      </w:r>
+    </w:p>
+    <w:p>
+      <w:pPr>
+        <w:pStyle w:val="ListBullet"/>
+        <w:jc w:val="both"/>
+      </w:pPr>
+      <w:r>
+        <w:rPr>
+          <w:b/>
+        </w:rPr>
+        <w:t xml:space="preserve">Mua theo nhu cầu thiết yếu: </w:t>
+      </w:r>
+      <w:r>
+        <w:t>nam giới chủ yếu mua đồ thiết yếu như quần áo, giày dép chứ ít chạy theo mốt (Brands Vietnam, 2024) – đúng với nhóm hàng Coolmate bán.</w:t>
+      </w:r>
+    </w:p>
+    <w:p>
+      <w:r>
+        <w:rPr>
+          <w:i/>
+          <w:color w:val="555555"/>
+          <w:sz w:val="21"/>
+        </w:rPr>
+        <w:t>Nguồn: Tuổi Trẻ. (2020, 18 tháng 8). 77% người xài Internet ở Việt Nam từng mua hàng online. https://tuoitre.vn/77-nguoi-xai-internet-o-viet-nam-tung-mua-hang-online-2020081817282187.htm</w:t>
+      </w:r>
+    </w:p>
+    <w:p>
       <w:r>
         <w:rPr>
           <w:i/>
@@ -1201,6 +1516,68 @@
       </w:r>
     </w:p>
     <w:p>
+      <w:r>
+        <w:rPr>
+          <w:i/>
+          <w:color w:val="555555"/>
+          <w:sz w:val="21"/>
+        </w:rPr>
+        <w:t>Nguồn: Brands Vietnam. (2024). Chuyện mua sắm thời trang của người Việt. https://www.brandsvietnam.com/congdong/topic/chuyen-mua-sam-thoi-trang-cua-nguoi-viet</w:t>
+      </w:r>
+    </w:p>
+    <w:p>
+      <w:pPr>
+        <w:jc w:val="both"/>
+      </w:pPr>
+      <w:r>
+        <w:rPr>
+          <w:i w:val="0"/>
+        </w:rPr>
+        <w:t>c) Nhu cầu lớn đến đâu?</w:t>
+      </w:r>
+    </w:p>
+    <w:p>
+      <w:pPr>
+        <w:jc w:val="both"/>
+      </w:pPr>
+      <w:r>
+        <w:rPr>
+          <w:i w:val="0"/>
+        </w:rPr>
+        <w:t>Năm 2019, Việt Nam có khoảng 44,8 triệu người mua sắm trực tuyến (VnBusiness, 2020). Nếu nam giới chiếm khoảng 40% (Brands Vietnam, 2018), có thể ước tính khoảng 18 triệu nam giới mua sắm trực tuyến – đây là phép tính của người viết, chỉ mang tính tham khảo. Mỗi người mua trực tuyến chi bình quân khoảng 225 đô la Mỹ mỗi năm (VnBusiness, 2020), và tổng doanh số bán lẻ trực tuyến đạt khoảng 10,08 tỷ đô la Mỹ (Tạp chí Công Thương, 2020).</w:t>
+      </w:r>
+    </w:p>
+    <w:p>
+      <w:r>
+        <w:rPr>
+          <w:i/>
+          <w:color w:val="555555"/>
+          <w:sz w:val="21"/>
+        </w:rPr>
+        <w:t>Nguồn: VnBusiness. (2020). Hơn 44 triệu người dân Việt Nam tham gia mua sắm trực tuyến. https://vnbusiness.vn/hon-44-trieu-nguoi-dan-viet-nam-tham-gia-mua-sam-truc-tuyen.html</w:t>
+      </w:r>
+    </w:p>
+    <w:p>
+      <w:r>
+        <w:rPr>
+          <w:i/>
+          <w:color w:val="555555"/>
+          <w:sz w:val="21"/>
+        </w:rPr>
+        <w:t>Nguồn: Brands Vietnam. (2018). Nielsen: Thương mại điện tử Việt Nam có thể đạt 10 tỷ USD. https://www.brandsvietnam.com/17321-Nielsen-Thuong-mai-dien-tu-Viet-Nam-co-the-dat-10-ty-USD</w:t>
+      </w:r>
+    </w:p>
+    <w:p>
+      <w:r>
+        <w:rPr>
+          <w:i/>
+          <w:color w:val="555555"/>
+          <w:sz w:val="21"/>
+        </w:rPr>
+        <w:t>Nguồn: Tạp chí Công Thương. (2020). Năm 2019, doanh số bán lẻ thương mại điện tử B2C đạt trên 10 tỷ USD. https://tapchicongthuong.vn/nam-2019--doanh-so-ban-le-thuong-mai-dien-tu-b2c-dat-tren-10-ty-usd-74423.htm</w:t>
+      </w:r>
+    </w:p>
+    <w:p>
       <w:pPr>
         <w:jc w:val="center"/>
       </w:pPr>
@@ -1209,7 +1586,1002 @@
           <w:b/>
           <w:i/>
         </w:rPr>
-        <w:t>Bảng 4. Dữ liệu khảo sát người tiêu dùng giai đoạn Coolmate khởi nghiệp</w:t>
+        <w:t>Bảng 5. Quy mô nhu cầu năm 2019</w:t>
+      </w:r>
+    </w:p>
+    <w:tbl>
+      <w:tblPr>
+        <w:tblStyle w:val="TableGrid"/>
+        <w:tblW w:type="auto" w:w="0"/>
+        <w:tblLook w:firstColumn="1" w:firstRow="1" w:lastColumn="0" w:lastRow="0" w:noHBand="0" w:noVBand="1" w:val="04A0"/>
+      </w:tblPr>
+      <w:tblGrid>
+        <w:gridCol w:w="2880"/>
+        <w:gridCol w:w="2880"/>
+        <w:gridCol w:w="2880"/>
+      </w:tblGrid>
+      <w:tr>
+        <w:tc>
+          <w:tcPr>
+            <w:tcW w:type="dxa" w:w="2880"/>
+            <w:shd w:val="clear" w:fill="1F3A60"/>
+          </w:tcPr>
+          <w:p>
+            <w:r>
+              <w:rPr>
+                <w:b/>
+                <w:color w:val="FFFFFF"/>
+                <w:sz w:val="23"/>
+              </w:rPr>
+              <w:t>Chỉ báo (2019)</w:t>
+            </w:r>
+          </w:p>
+        </w:tc>
+        <w:tc>
+          <w:tcPr>
+            <w:tcW w:type="dxa" w:w="2880"/>
+            <w:shd w:val="clear" w:fill="1F3A60"/>
+          </w:tcPr>
+          <w:p>
+            <w:r>
+              <w:rPr>
+                <w:b/>
+                <w:color w:val="FFFFFF"/>
+                <w:sz w:val="23"/>
+              </w:rPr>
+              <w:t>Giá trị</w:t>
+            </w:r>
+          </w:p>
+        </w:tc>
+        <w:tc>
+          <w:tcPr>
+            <w:tcW w:type="dxa" w:w="2880"/>
+            <w:shd w:val="clear" w:fill="1F3A60"/>
+          </w:tcPr>
+          <w:p>
+            <w:r>
+              <w:rPr>
+                <w:b/>
+                <w:color w:val="FFFFFF"/>
+                <w:sz w:val="23"/>
+              </w:rPr>
+              <w:t>Nguồn</w:t>
+            </w:r>
+          </w:p>
+        </w:tc>
+      </w:tr>
+      <w:tr>
+        <w:tc>
+          <w:tcPr>
+            <w:tcW w:type="dxa" w:w="2880"/>
+          </w:tcPr>
+          <w:p>
+            <w:r>
+              <w:rPr>
+                <w:sz w:val="23"/>
+              </w:rPr>
+              <w:t>Người mua sắm trực tuyến</w:t>
+            </w:r>
+          </w:p>
+        </w:tc>
+        <w:tc>
+          <w:tcPr>
+            <w:tcW w:type="dxa" w:w="2880"/>
+          </w:tcPr>
+          <w:p>
+            <w:r>
+              <w:rPr>
+                <w:sz w:val="23"/>
+              </w:rPr>
+              <w:t>Khoảng 44,8 triệu người</w:t>
+            </w:r>
+          </w:p>
+        </w:tc>
+        <w:tc>
+          <w:tcPr>
+            <w:tcW w:type="dxa" w:w="2880"/>
+          </w:tcPr>
+          <w:p>
+            <w:r>
+              <w:rPr>
+                <w:sz w:val="23"/>
+              </w:rPr>
+              <w:t>VnBusiness (2020)</w:t>
+            </w:r>
+          </w:p>
+        </w:tc>
+      </w:tr>
+      <w:tr>
+        <w:tc>
+          <w:tcPr>
+            <w:tcW w:type="dxa" w:w="2880"/>
+          </w:tcPr>
+          <w:p>
+            <w:r>
+              <w:rPr>
+                <w:sz w:val="23"/>
+              </w:rPr>
+              <w:t>Tỷ lệ nam trong người mua trực tuyến</w:t>
+            </w:r>
+          </w:p>
+        </w:tc>
+        <w:tc>
+          <w:tcPr>
+            <w:tcW w:type="dxa" w:w="2880"/>
+          </w:tcPr>
+          <w:p>
+            <w:r>
+              <w:rPr>
+                <w:sz w:val="23"/>
+              </w:rPr>
+              <w:t>Khoảng 40%</w:t>
+            </w:r>
+          </w:p>
+        </w:tc>
+        <w:tc>
+          <w:tcPr>
+            <w:tcW w:type="dxa" w:w="2880"/>
+          </w:tcPr>
+          <w:p>
+            <w:r>
+              <w:rPr>
+                <w:sz w:val="23"/>
+              </w:rPr>
+              <w:t>Brands Vietnam (2018)</w:t>
+            </w:r>
+          </w:p>
+        </w:tc>
+      </w:tr>
+      <w:tr>
+        <w:tc>
+          <w:tcPr>
+            <w:tcW w:type="dxa" w:w="2880"/>
+          </w:tcPr>
+          <w:p>
+            <w:r>
+              <w:rPr>
+                <w:sz w:val="23"/>
+              </w:rPr>
+              <w:t>Số nam giới mua sắm trực tuyến (ước tính)</w:t>
+            </w:r>
+          </w:p>
+        </w:tc>
+        <w:tc>
+          <w:tcPr>
+            <w:tcW w:type="dxa" w:w="2880"/>
+          </w:tcPr>
+          <w:p>
+            <w:r>
+              <w:rPr>
+                <w:sz w:val="23"/>
+              </w:rPr>
+              <w:t>Khoảng 18 triệu người</w:t>
+            </w:r>
+          </w:p>
+        </w:tc>
+        <w:tc>
+          <w:tcPr>
+            <w:tcW w:type="dxa" w:w="2880"/>
+          </w:tcPr>
+          <w:p>
+            <w:r>
+              <w:rPr>
+                <w:sz w:val="23"/>
+              </w:rPr>
+              <w:t>Người viết tính: 44,8 triệu × 40%</w:t>
+            </w:r>
+          </w:p>
+        </w:tc>
+      </w:tr>
+      <w:tr>
+        <w:tc>
+          <w:tcPr>
+            <w:tcW w:type="dxa" w:w="2880"/>
+          </w:tcPr>
+          <w:p>
+            <w:r>
+              <w:rPr>
+                <w:sz w:val="23"/>
+              </w:rPr>
+              <w:t>Chi tiêu trực tuyến bình quân</w:t>
+            </w:r>
+          </w:p>
+        </w:tc>
+        <w:tc>
+          <w:tcPr>
+            <w:tcW w:type="dxa" w:w="2880"/>
+          </w:tcPr>
+          <w:p>
+            <w:r>
+              <w:rPr>
+                <w:sz w:val="23"/>
+              </w:rPr>
+              <w:t>Khoảng 225 đô la Mỹ/người/năm</w:t>
+            </w:r>
+          </w:p>
+        </w:tc>
+        <w:tc>
+          <w:tcPr>
+            <w:tcW w:type="dxa" w:w="2880"/>
+          </w:tcPr>
+          <w:p>
+            <w:r>
+              <w:rPr>
+                <w:sz w:val="23"/>
+              </w:rPr>
+              <w:t>VnBusiness (2020)</w:t>
+            </w:r>
+          </w:p>
+        </w:tc>
+      </w:tr>
+      <w:tr>
+        <w:tc>
+          <w:tcPr>
+            <w:tcW w:type="dxa" w:w="2880"/>
+          </w:tcPr>
+          <w:p>
+            <w:r>
+              <w:rPr>
+                <w:sz w:val="23"/>
+              </w:rPr>
+              <w:t>Doanh số bán lẻ trực tuyến B2C</w:t>
+            </w:r>
+          </w:p>
+        </w:tc>
+        <w:tc>
+          <w:tcPr>
+            <w:tcW w:type="dxa" w:w="2880"/>
+          </w:tcPr>
+          <w:p>
+            <w:r>
+              <w:rPr>
+                <w:sz w:val="23"/>
+              </w:rPr>
+              <w:t>Khoảng 10,08 tỷ đô la Mỹ</w:t>
+            </w:r>
+          </w:p>
+        </w:tc>
+        <w:tc>
+          <w:tcPr>
+            <w:tcW w:type="dxa" w:w="2880"/>
+          </w:tcPr>
+          <w:p>
+            <w:r>
+              <w:rPr>
+                <w:sz w:val="23"/>
+              </w:rPr>
+              <w:t>Tạp chí Công Thương (2020)</w:t>
+            </w:r>
+          </w:p>
+        </w:tc>
+      </w:tr>
+    </w:tbl>
+    <w:p/>
+    <w:p>
+      <w:pPr>
+        <w:jc w:val="both"/>
+      </w:pPr>
+      <w:r>
+        <w:rPr>
+          <w:i w:val="0"/>
+        </w:rPr>
+        <w:t>d) Nhu cầu có cấp thiết và lặp lại không?</w:t>
+      </w:r>
+    </w:p>
+    <w:p>
+      <w:pPr>
+        <w:jc w:val="both"/>
+      </w:pPr>
+      <w:r>
+        <w:rPr>
+          <w:i w:val="0"/>
+        </w:rPr>
+        <w:t>Đồ mặc hằng ngày như áo thun, quần lót, tất là hàng tiêu hao – mặc, giặt thường xuyên nên phải thay mới nhiều lần trong năm. Khác với áo vest hay đồ dự tiệc, người mua không thể “nhịn” mua những món này. Điều đó khiến nhu cầu mang tính lặp lại, tạo cơ hội cho một thương hiệu có khách quay lại thường xuyên. Bằng chứng sau này: Coolmate bán gần 2 triệu chiếc quần lót chỉ trong năm 2024 (Tuổi Trẻ, 2025), và bình quân mỗi khách mua khoảng 4,75 sản phẩm trong năm 2025 (người viết tính từ Bùi, 2026: 5,7 triệu sản phẩm / 1,2 triệu khách).</w:t>
+      </w:r>
+    </w:p>
+    <w:p>
+      <w:r>
+        <w:rPr>
+          <w:i/>
+          <w:color w:val="555555"/>
+          <w:sz w:val="21"/>
+        </w:rPr>
+        <w:t>Nguồn: Tuổi Trẻ. (2025, 7 tháng 1). Start-up bán gần 2 triệu chiếc quần lót năm 2024 tham vọng thành “kỳ lân”. https://tuoitre.vn/startup-ban-gan-2-trieu-chiec-quan-lot-nam-2024-tham-vong-thanh-ky-lan-20250107183310267.htm</w:t>
+      </w:r>
+    </w:p>
+    <w:p>
+      <w:r>
+        <w:rPr>
+          <w:i/>
+          <w:color w:val="555555"/>
+          <w:sz w:val="21"/>
+        </w:rPr>
+        <w:t>Nguồn: Bùi, N. (2026, ngày 25 tháng 2). Phạm Chí Nhu, nhà sáng lập Coolmate: Thế giới đã chọn Việt Nam, không lẽ doanh nghiệp lại thiếu tự tin. Liên đoàn Thương mại và Công nghiệp Việt Nam. https://vcci.com.vn/news/pham-chi-nhu-ceo-nha-sang-lap-coolmate-the-gioi-da-chon-viet-nam-khong-le-doanh-nghiep-lai-thieu-tu-tin</w:t>
+      </w:r>
+    </w:p>
+    <w:p>
+      <w:pPr>
+        <w:jc w:val="both"/>
+      </w:pPr>
+      <w:r>
+        <w:rPr>
+          <w:i w:val="0"/>
+        </w:rPr>
+        <w:t>e) Khách hàng sẵn sàng trả bao nhiêu?</w:t>
+      </w:r>
+    </w:p>
+    <w:p>
+      <w:pPr>
+        <w:jc w:val="both"/>
+      </w:pPr>
+      <w:r>
+        <w:rPr>
+          <w:i w:val="0"/>
+        </w:rPr>
+        <w:t>Với ngân sách thời trang phần lớn dưới 300.000–500.000 đồng mỗi tháng (Q&amp;Me, 2017a, 2017b), khách hàng chỉ sẵn sàng trả mức giá phổ thông cho từng món đồ cơ bản. Các mức giá Coolmate đưa ra – quần lót khoảng 129.000 đồng, áo thun thể thao khoảng 199.000 đồng (Coolmate, không ghi ngày-e, không ghi ngày-f) – nằm trong ngân sách đó: một khách có thể mua 2–3 món mỗi tháng.</w:t>
+      </w:r>
+    </w:p>
+    <w:p>
+      <w:r>
+        <w:rPr>
+          <w:i/>
+          <w:color w:val="555555"/>
+          <w:sz w:val="21"/>
+        </w:rPr>
+        <w:t>Nguồn: Q&amp;Me. (2017a). Thói quen mua sắm thời trang của người Việt [Báo cáo nghiên cứu thị trường]. https://qandme.net/vi/baibaocao/thoi-quen-mua-sam-thoi-trang-cua-nguoi-viet.html</w:t>
+      </w:r>
+    </w:p>
+    <w:p>
+      <w:r>
+        <w:rPr>
+          <w:i/>
+          <w:color w:val="555555"/>
+          <w:sz w:val="21"/>
+        </w:rPr>
+        <w:t>Nguồn: Q&amp;Me. (2017b). Các thương hiệu thời trang Việt phổ biến [Báo cáo nghiên cứu thị trường]. https://qandme.net/vi/baibaocao/cac-thuong-hieu-thoi-trang-viet-pho-bien.html</w:t>
+      </w:r>
+    </w:p>
+    <w:p>
+      <w:r>
+        <w:rPr>
+          <w:i/>
+          <w:color w:val="555555"/>
+          <w:sz w:val="21"/>
+        </w:rPr>
+        <w:t>Nguồn: Coolmate. (không ghi ngày-e). Quần lót nam chạy bộ Fast &amp; Free (trang sản phẩm). Truy cập ngày 10 tháng 10 năm 2026, tại https://www.coolmate.me/product/quan-lot-nam-chay-bo-fast-free-run?color=den</w:t>
+      </w:r>
+    </w:p>
+    <w:p>
+      <w:r>
+        <w:rPr>
+          <w:i/>
+          <w:color w:val="555555"/>
+          <w:sz w:val="21"/>
+        </w:rPr>
+        <w:t>Nguồn: Coolmate. (không ghi ngày-f). Áo thun nam thể thao Active (trang sản phẩm). Truy cập ngày 10 tháng 10 năm 2026, tại https://www.coolmate.me/product/ao-thun-the-thao-active-phoi-mau-thoang-khi2?color=den</w:t>
+      </w:r>
+    </w:p>
+    <w:p>
+      <w:pPr>
+        <w:jc w:val="both"/>
+      </w:pPr>
+      <w:r>
+        <w:rPr>
+          <w:i w:val="0"/>
+        </w:rPr>
+        <w:t>f) Nhu cầu được nhà sáng lập phát hiện như thế nào?</w:t>
+      </w:r>
+    </w:p>
+    <w:p>
+      <w:pPr>
+        <w:jc w:val="both"/>
+      </w:pPr>
+      <w:r>
+        <w:rPr>
+          <w:i w:val="0"/>
+        </w:rPr>
+        <w:t>Ông Phạm Chí Nhu từng quản lý trang bán hàng trực tuyến của một thương hiệu thời trang và nhận thấy quần áo cùng chất lượng ở Việt Nam có giá chênh lệch lớn so với Singapore (Vietcetera, 2020). Khi tự bán quần áo trên Shopee, ông nhận ra phí sàn làm tăng giá bán (Vertex Ventures, 2024). Từ đó ông kết luận: khách hàng cần đồ tốt với giá hợp lý, và cách để giảm giá là bán thẳng tới người tiêu dùng.</w:t>
+      </w:r>
+    </w:p>
+    <w:p>
+      <w:r>
+        <w:rPr>
+          <w:i/>
+          <w:color w:val="555555"/>
+          <w:sz w:val="21"/>
+        </w:rPr>
+        <w:t>Nguồn: Vietcetera. (2020). A brand’s story: Coolmate – A smart solution for the male wardrobe. https://vietcetera.com/en/a-brands-story-coolmate--a-smart-solution-for-the-male-wardrobe</w:t>
+      </w:r>
+    </w:p>
+    <w:p>
+      <w:r>
+        <w:rPr>
+          <w:i/>
+          <w:color w:val="555555"/>
+          <w:sz w:val="21"/>
+        </w:rPr>
+        <w:t>Nguồn: Vertex Ventures. (2024). Coolmate wants to be Vietnam’s next unicorn. https://www.vertexventures.sg/news/coolmate-wants-to-be-vietnams-next-unicorn/</w:t>
+      </w:r>
+    </w:p>
+    <w:p>
+      <w:pPr>
+        <w:jc w:val="both"/>
+      </w:pPr>
+      <w:r>
+        <w:rPr>
+          <w:i w:val="0"/>
+        </w:rPr>
+        <w:t>g) Hạn chế của nhu cầu</w:t>
+      </w:r>
+    </w:p>
+    <w:p>
+      <w:pPr>
+        <w:pStyle w:val="ListBullet"/>
+        <w:jc w:val="both"/>
+      </w:pPr>
+      <w:r>
+        <w:t>Khách hàng rất nhạy cảm về giá, dễ chuyển sang nhà bán rẻ hơn trên sàn.</w:t>
+      </w:r>
+    </w:p>
+    <w:p>
+      <w:pPr>
+        <w:pStyle w:val="ListBullet"/>
+        <w:jc w:val="both"/>
+      </w:pPr>
+      <w:r>
+        <w:t>Các khảo sát năm 2017–2019 không tách riêng số liệu nam giới mua đồ cơ bản; con số 18 triệu khách nam chỉ là ước tính.</w:t>
+      </w:r>
+    </w:p>
+    <w:p>
+      <w:pPr>
+        <w:pStyle w:val="ListBullet"/>
+        <w:jc w:val="both"/>
+      </w:pPr>
+      <w:r>
+        <w:t>Chưa có dữ liệu công khai về tỷ lệ khách quay lại mua.</w:t>
+      </w:r>
+    </w:p>
+    <w:p>
+      <w:pPr>
+        <w:jc w:val="both"/>
+      </w:pPr>
+      <w:r>
+        <w:rPr>
+          <w:b/>
+        </w:rPr>
+        <w:t xml:space="preserve">Đánh giá: </w:t>
+      </w:r>
+      <w:r>
+        <w:rPr>
+          <w:i w:val="0"/>
+        </w:rPr>
+        <w:t>Nhu cầu rõ ràng: nam giới trẻ cần đồ mặc hằng ngày giá vừa túi tiền, chất lượng đáng tin, đổi trả dễ và mua tiện qua mạng. Nhu cầu này lớn (ước tính khoảng 18 triệu nam giới mua sắm trực tuyến năm 2019), lặp lại thường xuyên và phù hợp với khả năng chi trả. Chấm 4/5 vì khách hàng rất nhạy cảm giá và chưa có khảo sát riêng về nhóm nam giới mua đồ cơ bản.</w:t>
+      </w:r>
+    </w:p>
+    <w:p>
+      <w:pPr>
+        <w:pStyle w:val="Heading2"/>
+      </w:pPr>
+      <w:r>
+        <w:rPr>
+          <w:rFonts w:ascii="Times New Roman" w:hAnsi="Times New Roman"/>
+          <w:color w:val="1F3A60"/>
+        </w:rPr>
+        <w:t>2. Giải pháp – 4/5</w:t>
+      </w:r>
+    </w:p>
+    <w:p>
+      <w:pPr>
+        <w:jc w:val="both"/>
+      </w:pPr>
+      <w:r>
+        <w:rPr>
+          <w:b/>
+        </w:rPr>
+        <w:t xml:space="preserve">Câu hỏi đặt ra: </w:t>
+      </w:r>
+      <w:r>
+        <w:rPr>
+          <w:i/>
+        </w:rPr>
+        <w:t>Sản phẩm và cách phục vụ của Coolmate có giải quyết đúng các điểm đau không? Khác biệt ở đâu? Lợi thế giữ được đến mức nào?</w:t>
+      </w:r>
+    </w:p>
+    <w:p>
+      <w:pPr>
+        <w:jc w:val="both"/>
+      </w:pPr>
+      <w:r>
+        <w:rPr>
+          <w:i w:val="0"/>
+        </w:rPr>
+        <w:t>a) Gói giải pháp ba thành phần</w:t>
+      </w:r>
+    </w:p>
+    <w:p>
+      <w:pPr>
+        <w:jc w:val="center"/>
+      </w:pPr>
+      <w:r>
+        <w:rPr>
+          <w:b/>
+          <w:i/>
+        </w:rPr>
+        <w:t>Bảng 6. Giải pháp của Coolmate</w:t>
+      </w:r>
+    </w:p>
+    <w:tbl>
+      <w:tblPr>
+        <w:tblStyle w:val="TableGrid"/>
+        <w:tblW w:type="auto" w:w="0"/>
+        <w:tblLook w:firstColumn="1" w:firstRow="1" w:lastColumn="0" w:lastRow="0" w:noHBand="0" w:noVBand="1" w:val="04A0"/>
+      </w:tblPr>
+      <w:tblGrid>
+        <w:gridCol w:w="2880"/>
+        <w:gridCol w:w="2880"/>
+        <w:gridCol w:w="2880"/>
+      </w:tblGrid>
+      <w:tr>
+        <w:tc>
+          <w:tcPr>
+            <w:tcW w:type="dxa" w:w="2880"/>
+            <w:shd w:val="clear" w:fill="1F3A60"/>
+          </w:tcPr>
+          <w:p>
+            <w:r>
+              <w:rPr>
+                <w:b/>
+                <w:color w:val="FFFFFF"/>
+                <w:sz w:val="23"/>
+              </w:rPr>
+              <w:t>Thành phần</w:t>
+            </w:r>
+          </w:p>
+        </w:tc>
+        <w:tc>
+          <w:tcPr>
+            <w:tcW w:type="dxa" w:w="2880"/>
+            <w:shd w:val="clear" w:fill="1F3A60"/>
+          </w:tcPr>
+          <w:p>
+            <w:r>
+              <w:rPr>
+                <w:b/>
+                <w:color w:val="FFFFFF"/>
+                <w:sz w:val="23"/>
+              </w:rPr>
+              <w:t>Nội dung</w:t>
+            </w:r>
+          </w:p>
+        </w:tc>
+        <w:tc>
+          <w:tcPr>
+            <w:tcW w:type="dxa" w:w="2880"/>
+            <w:shd w:val="clear" w:fill="1F3A60"/>
+          </w:tcPr>
+          <w:p>
+            <w:r>
+              <w:rPr>
+                <w:b/>
+                <w:color w:val="FFFFFF"/>
+                <w:sz w:val="23"/>
+              </w:rPr>
+              <w:t>Điểm đau được giải quyết</w:t>
+            </w:r>
+          </w:p>
+        </w:tc>
+      </w:tr>
+      <w:tr>
+        <w:tc>
+          <w:tcPr>
+            <w:tcW w:type="dxa" w:w="2880"/>
+          </w:tcPr>
+          <w:p>
+            <w:r>
+              <w:rPr>
+                <w:sz w:val="23"/>
+              </w:rPr>
+              <w:t>Sản phẩm</w:t>
+            </w:r>
+          </w:p>
+        </w:tc>
+        <w:tc>
+          <w:tcPr>
+            <w:tcW w:type="dxa" w:w="2880"/>
+          </w:tcPr>
+          <w:p>
+            <w:r>
+              <w:rPr>
+                <w:sz w:val="23"/>
+              </w:rPr>
+              <w:t>Đồ cơ bản ít phụ thuộc trào lưu; chất liệu Excool thấm hút, nhanh khô, co giãn</w:t>
+            </w:r>
+          </w:p>
+        </w:tc>
+        <w:tc>
+          <w:tcPr>
+            <w:tcW w:type="dxa" w:w="2880"/>
+          </w:tcPr>
+          <w:p>
+            <w:r>
+              <w:rPr>
+                <w:sz w:val="23"/>
+              </w:rPr>
+              <w:t>Chất lượng không đồng đều</w:t>
+            </w:r>
+          </w:p>
+        </w:tc>
+      </w:tr>
+      <w:tr>
+        <w:tc>
+          <w:tcPr>
+            <w:tcW w:type="dxa" w:w="2880"/>
+          </w:tcPr>
+          <w:p>
+            <w:r>
+              <w:rPr>
+                <w:sz w:val="23"/>
+              </w:rPr>
+              <w:t>Kênh bán</w:t>
+            </w:r>
+          </w:p>
+        </w:tc>
+        <w:tc>
+          <w:tcPr>
+            <w:tcW w:type="dxa" w:w="2880"/>
+          </w:tcPr>
+          <w:p>
+            <w:r>
+              <w:rPr>
+                <w:sz w:val="23"/>
+              </w:rPr>
+              <w:t>Bán trực tiếp qua trang mạng riêng, sau mở rộng ra sàn và cửa hàng</w:t>
+            </w:r>
+          </w:p>
+        </w:tc>
+        <w:tc>
+          <w:tcPr>
+            <w:tcW w:type="dxa" w:w="2880"/>
+          </w:tcPr>
+          <w:p>
+            <w:r>
+              <w:rPr>
+                <w:sz w:val="23"/>
+              </w:rPr>
+              <w:t>Tốn thời gian đi mua</w:t>
+            </w:r>
+          </w:p>
+        </w:tc>
+      </w:tr>
+      <w:tr>
+        <w:tc>
+          <w:tcPr>
+            <w:tcW w:type="dxa" w:w="2880"/>
+          </w:tcPr>
+          <w:p>
+            <w:r>
+              <w:rPr>
+                <w:sz w:val="23"/>
+              </w:rPr>
+              <w:t>Hậu mãi</w:t>
+            </w:r>
+          </w:p>
+        </w:tc>
+        <w:tc>
+          <w:tcPr>
+            <w:tcW w:type="dxa" w:w="2880"/>
+          </w:tcPr>
+          <w:p>
+            <w:r>
+              <w:rPr>
+                <w:sz w:val="23"/>
+              </w:rPr>
+              <w:t>Đổi trả 60 ngày với sản phẩm đủ điều kiện, kể cả một số sản phẩm đã sử dụng</w:t>
+            </w:r>
+          </w:p>
+        </w:tc>
+        <w:tc>
+          <w:tcPr>
+            <w:tcW w:type="dxa" w:w="2880"/>
+          </w:tcPr>
+          <w:p>
+            <w:r>
+              <w:rPr>
+                <w:sz w:val="23"/>
+              </w:rPr>
+              <w:t>Sợ mua sai</w:t>
+            </w:r>
+          </w:p>
+        </w:tc>
+      </w:tr>
+      <w:tr>
+        <w:tc>
+          <w:tcPr>
+            <w:tcW w:type="dxa" w:w="2880"/>
+          </w:tcPr>
+          <w:p>
+            <w:r>
+              <w:rPr>
+                <w:sz w:val="23"/>
+              </w:rPr>
+              <w:t>Giá</w:t>
+            </w:r>
+          </w:p>
+        </w:tc>
+        <w:tc>
+          <w:tcPr>
+            <w:tcW w:type="dxa" w:w="2880"/>
+          </w:tcPr>
+          <w:p>
+            <w:r>
+              <w:rPr>
+                <w:sz w:val="23"/>
+              </w:rPr>
+              <w:t>Phổ thông: quần lót khoảng 129.000 đồng, áo thun thể thao khoảng 199.000 đồng</w:t>
+            </w:r>
+          </w:p>
+        </w:tc>
+        <w:tc>
+          <w:tcPr>
+            <w:tcW w:type="dxa" w:w="2880"/>
+          </w:tcPr>
+          <w:p>
+            <w:r>
+              <w:rPr>
+                <w:sz w:val="23"/>
+              </w:rPr>
+              <w:t>Hàng tốt thì đắt</w:t>
+            </w:r>
+          </w:p>
+        </w:tc>
+      </w:tr>
+    </w:tbl>
+    <w:p/>
+    <w:p>
+      <w:r>
+        <w:rPr>
+          <w:i/>
+          <w:color w:val="555555"/>
+          <w:sz w:val="21"/>
+        </w:rPr>
+        <w:t>Nguồn: Coolmate. (2023a, ngày 19 tháng 6). Khám phá dòng sản phẩm mang công nghệ vải Excool. https://www.coolmate.me/blog/dong-san-pham-cong-nghe-excool-tai-coolmate-2044</w:t>
+      </w:r>
+    </w:p>
+    <w:p>
+      <w:r>
+        <w:rPr>
+          <w:i/>
+          <w:color w:val="555555"/>
+          <w:sz w:val="21"/>
+        </w:rPr>
+        <w:t>Nguồn: Coolmate. (không ghi ngày-d). Dịch vụ 60 ngày đổi trả. Truy cập ngày 10 tháng 10 năm 2026, tại https://www.coolmate.me/page/dich-vu-60-ngay-doi-tra</w:t>
+      </w:r>
+    </w:p>
+    <w:p>
+      <w:r>
+        <w:rPr>
+          <w:i/>
+          <w:color w:val="555555"/>
+          <w:sz w:val="21"/>
+        </w:rPr>
+        <w:t>Nguồn: Coolmate. (không ghi ngày-e). Quần lót nam chạy bộ Fast &amp; Free (trang sản phẩm). Truy cập ngày 10 tháng 10 năm 2026, tại https://www.coolmate.me/product/quan-lot-nam-chay-bo-fast-free-run?color=den</w:t>
+      </w:r>
+    </w:p>
+    <w:p>
+      <w:r>
+        <w:rPr>
+          <w:i/>
+          <w:color w:val="555555"/>
+          <w:sz w:val="21"/>
+        </w:rPr>
+        <w:t>Nguồn: Coolmate. (không ghi ngày-f). Áo thun nam thể thao Active (trang sản phẩm). Truy cập ngày 10 tháng 10 năm 2026, tại https://www.coolmate.me/product/ao-thun-the-thao-active-phoi-mau-thoang-khi2?color=den</w:t>
+      </w:r>
+    </w:p>
+    <w:p>
+      <w:pPr>
+        <w:jc w:val="both"/>
+      </w:pPr>
+      <w:r>
+        <w:rPr>
+          <w:i w:val="0"/>
+        </w:rPr>
+        <w:t>b) Mô hình bán trực tiếp – nguồn gốc của giá hợp lý</w:t>
+      </w:r>
+    </w:p>
+    <w:p>
+      <w:pPr>
+        <w:jc w:val="both"/>
+      </w:pPr>
+      <w:r>
+        <w:rPr>
+          <w:i w:val="0"/>
+        </w:rPr>
+        <w:t>Bằng cách bán thẳng tới người tiêu dùng qua kênh trực tuyến, Coolmate cắt giảm chi phí trung gian và chi phí cửa hàng của bán lẻ truyền thống (Đại biểu Nhân dân, 2022), từ đó dồn chi phí vào chất lượng sản phẩm và trải nghiệm mua hàng thay vì quảng cáo rầm rộ (Brands Vietnam, 2023).</w:t>
+      </w:r>
+    </w:p>
+    <w:p>
+      <w:r>
+        <w:rPr>
+          <w:i/>
+          <w:color w:val="555555"/>
+          <w:sz w:val="21"/>
+        </w:rPr>
+        <w:t>Nguồn: Đại biểu Nhân dân. (2022). Coolmate – Hành trình từ con số 0 đến doanh thu trăm tỷ. https://daibieunhandan.vn/coolmate-hanh-trinh-tu-con-so-0-den-doanh-thu-tram-ty-10308212.html</w:t>
+      </w:r>
+    </w:p>
+    <w:p>
+      <w:r>
+        <w:rPr>
+          <w:i/>
+          <w:color w:val="555555"/>
+          <w:sz w:val="21"/>
+        </w:rPr>
+        <w:t>Nguồn: Brands Vietnam. (2023). Case study startup thành công – Cách Coolmate tăng trưởng 4 lần/năm. https://www.brandsvietnam.com/congdong/topic/332810-case-study-startup-thanh-cong-cach-coolmate-tang-truong-4-lan-nam</w:t>
+      </w:r>
+    </w:p>
+    <w:p>
+      <w:pPr>
+        <w:jc w:val="both"/>
+      </w:pPr>
+      <w:r>
+        <w:rPr>
+          <w:i w:val="0"/>
+        </w:rPr>
+        <w:t>c) Chính sách đổi trả – xóa nỗi sợ mua sai</w:t>
+      </w:r>
+    </w:p>
+    <w:p>
+      <w:pPr>
+        <w:jc w:val="both"/>
+      </w:pPr>
+      <w:r>
+        <w:rPr>
+          <w:i w:val="0"/>
+        </w:rPr>
+        <w:t>Chính sách đổi trả 60 ngày là “vũ khí” giúp khách mạnh dạn mua lần đầu. Tuy nhiên, chính sách có ngoại lệ với hàng thanh lý, hàng theo yêu cầu và một số nhóm khuyến mại (Coolmate, không ghi ngày-d), nên không phải mọi sản phẩm đều được đổi trả vô điều kiện.</w:t>
+      </w:r>
+    </w:p>
+    <w:p>
+      <w:r>
+        <w:rPr>
+          <w:i/>
+          <w:color w:val="555555"/>
+          <w:sz w:val="21"/>
+        </w:rPr>
+        <w:t>Nguồn: Coolmate. (không ghi ngày-d). Dịch vụ 60 ngày đổi trả. Truy cập ngày 10 tháng 10 năm 2026, tại https://www.coolmate.me/page/dich-vu-60-ngay-doi-tra</w:t>
+      </w:r>
+    </w:p>
+    <w:p>
+      <w:pPr>
+        <w:jc w:val="both"/>
+      </w:pPr>
+      <w:r>
+        <w:rPr>
+          <w:i w:val="0"/>
+        </w:rPr>
+        <w:t>d) Từ một kênh sang nhiều kênh</w:t>
+      </w:r>
+    </w:p>
+    <w:p>
+      <w:pPr>
+        <w:jc w:val="both"/>
+      </w:pPr>
+      <w:r>
+        <w:rPr>
+          <w:i w:val="0"/>
+        </w:rPr>
+        <w:t>Từ tháng 3/2026, cửa hàng tại Hà Nội cho khách trực tiếp thử chất vải và kích cỡ. Hệ thống công nghệ do doanh nghiệp tự xây dựng đồng bộ dữ liệu đơn hàng, tồn kho và khách hàng trên các kênh (Ng, 2026). Đến tháng 11/2025, Coolmate đã giao hơn 5 triệu đơn hàng trong hơn sáu năm (Coolmate, 2025).</w:t>
+      </w:r>
+    </w:p>
+    <w:p>
+      <w:r>
+        <w:rPr>
+          <w:i/>
+          <w:color w:val="555555"/>
+          <w:sz w:val="21"/>
+        </w:rPr>
+        <w:t>Nguồn: Ng, V. (2026, ngày 15 tháng 5). How a Vietnamese D2C retailer built its own secure digital infrastructure. DigiconAsia. https://digiconasia.net/features/how-a-vietnamese-d2c-retailer-built-its-own-secure-digital-infrastructure</w:t>
+      </w:r>
+    </w:p>
+    <w:p>
+      <w:r>
+        <w:rPr>
+          <w:i/>
+          <w:color w:val="555555"/>
+          <w:sz w:val="21"/>
+        </w:rPr>
+        <w:t>Nguồn: Coolmate. (2025, ngày 3 tháng 11). Coolmate gọi vốn thành công vòng đầu tư tăng trưởng, mở ra chương mới cho thương hiệu Việt. https://www.coolmate.me/blog/coolmate-goi-von-thanh-cong-series-c-mo-ra-chuong-moi-cho-thuong-hieu-viet</w:t>
+      </w:r>
+    </w:p>
+    <w:p>
+      <w:pPr>
+        <w:jc w:val="both"/>
+      </w:pPr>
+      <w:r>
+        <w:rPr>
+          <w:i w:val="0"/>
+        </w:rPr>
+        <w:t>e) Tính bền vững của lợi thế</w:t>
+      </w:r>
+    </w:p>
+    <w:p>
+      <w:pPr>
+        <w:jc w:val="both"/>
+      </w:pPr>
+      <w:r>
+        <w:rPr>
+          <w:i w:val="0"/>
+        </w:rPr>
+        <w:t>Đối thủ có thể sao chép sản phẩm đơn giản hoặc chính sách đổi trả. Rào cản bền vững hơn nằm ở năng lực phối hợp thiết kế, dữ liệu bán hàng, chất lượng nhà cung cấp và niềm tin tích lũy qua hàng triệu đơn hàng. Thông tin về chất liệu do doanh nghiệp tự công bố, cần đối chiếu với kiểm nghiệm độc lập.</w:t>
+      </w:r>
+    </w:p>
+    <w:p>
+      <w:pPr>
+        <w:jc w:val="both"/>
+      </w:pPr>
+      <w:r>
+        <w:rPr>
+          <w:b/>
+        </w:rPr>
+        <w:t xml:space="preserve">Đánh giá: </w:t>
+      </w:r>
+      <w:r>
+        <w:rPr>
+          <w:i w:val="0"/>
+        </w:rPr>
+        <w:t>Giải pháp khớp trực tiếp với từng điểm đau năm 2019 và đã được thị trường chấp nhận. Chấm 4/5 vì sản phẩm và chính sách dễ bị sao chép, đồng thời chưa có dữ liệu về lợi nhuận ròng trên mỗi đơn hàng.</w:t>
+      </w:r>
+    </w:p>
+    <w:p>
+      <w:pPr>
+        <w:pStyle w:val="Heading2"/>
+      </w:pPr>
+      <w:r>
+        <w:rPr>
+          <w:rFonts w:ascii="Times New Roman" w:hAnsi="Times New Roman"/>
+          <w:color w:val="1F3A60"/>
+        </w:rPr>
+        <w:t>3. Đội ngũ sáng lập – 4/5</w:t>
+      </w:r>
+    </w:p>
+    <w:p>
+      <w:pPr>
+        <w:jc w:val="both"/>
+      </w:pPr>
+      <w:r>
+        <w:rPr>
+          <w:b/>
+        </w:rPr>
+        <w:t xml:space="preserve">Câu hỏi đặt ra: </w:t>
+      </w:r>
+      <w:r>
+        <w:rPr>
+          <w:i/>
+        </w:rPr>
+        <w:t>Nhóm sáng lập là ai, có học vấn và kinh nghiệm gì, có bổ trợ nhau và đủ năng lực biến ý tưởng thành kinh doanh thực tế không?</w:t>
+      </w:r>
+    </w:p>
+    <w:p>
+      <w:pPr>
+        <w:jc w:val="both"/>
+      </w:pPr>
+      <w:r>
+        <w:rPr>
+          <w:i w:val="0"/>
+        </w:rPr>
+        <w:t>a) Chân dung từng nhà sáng lập</w:t>
+      </w:r>
+    </w:p>
+    <w:p>
+      <w:pPr>
+        <w:jc w:val="center"/>
+      </w:pPr>
+      <w:r>
+        <w:rPr>
+          <w:b/>
+          <w:i/>
+        </w:rPr>
+        <w:t>Bảng 7. Hồ sơ đội ngũ sáng lập Coolmate</w:t>
       </w:r>
     </w:p>
     <w:tbl>
@@ -1237,7 +2609,7 @@
                 <w:color w:val="FFFFFF"/>
                 <w:sz w:val="23"/>
               </w:rPr>
-              <w:t>Khảo sát / nguồn</w:t>
+              <w:t>Nhà sáng lập</w:t>
             </w:r>
           </w:p>
         </w:tc>
@@ -1253,7 +2625,7 @@
                 <w:color w:val="FFFFFF"/>
                 <w:sz w:val="23"/>
               </w:rPr>
-              <w:t>Mẫu</w:t>
+              <w:t>Vai trò tại Coolmate</w:t>
             </w:r>
           </w:p>
         </w:tc>
@@ -1269,7 +2641,7 @@
                 <w:color w:val="FFFFFF"/>
                 <w:sz w:val="23"/>
               </w:rPr>
-              <w:t>Kết quả chính</w:t>
+              <w:t>Học vấn</w:t>
             </w:r>
           </w:p>
         </w:tc>
@@ -1285,7 +2657,7 @@
                 <w:color w:val="FFFFFF"/>
                 <w:sz w:val="23"/>
               </w:rPr>
-              <w:t>Hàm ý với Coolmate</w:t>
+              <w:t>Kinh nghiệm trước Coolmate</w:t>
             </w:r>
           </w:p>
         </w:tc>
@@ -1300,7 +2672,7 @@
               <w:rPr>
                 <w:sz w:val="23"/>
               </w:rPr>
-              <w:t>Q&amp;Me (2017a)</w:t>
+              <w:t>Phạm Chí Nhu</w:t>
             </w:r>
           </w:p>
         </w:tc>
@@ -1313,7 +2685,7 @@
               <w:rPr>
                 <w:sz w:val="23"/>
               </w:rPr>
-              <w:t>512 người, 18–39 tuổi</w:t>
+              <w:t>Đồng sáng lập, Tổng Giám đốc (từ 2019)</w:t>
             </w:r>
           </w:p>
         </w:tc>
@@ -1326,7 +2698,7 @@
               <w:rPr>
                 <w:sz w:val="23"/>
               </w:rPr>
-              <w:t>Gần 50% chi dưới 300.000 đồng/tháng cho thời trang</w:t>
+              <w:t>Đại học Ngoại thương</w:t>
             </w:r>
           </w:p>
         </w:tc>
@@ -1339,7 +2711,7 @@
               <w:rPr>
                 <w:sz w:val="23"/>
               </w:rPr>
-              <w:t>Cần sản phẩm giá phổ thông</w:t>
+              <w:t>Làm trong ngành kiểm toán; quản lý trang thương mại điện tử của một thương hiệu thời trang; từng làm việc tại Deloitte và adidas (theo hồ sơ CB Insights); tự bán quần áo trên Shopee</w:t>
             </w:r>
           </w:p>
         </w:tc>
@@ -1354,7 +2726,7 @@
               <w:rPr>
                 <w:sz w:val="23"/>
               </w:rPr>
-              <w:t>Q&amp;Me (2017b)</w:t>
+              <w:t>Nguyễn Hoài Xuân Lan</w:t>
             </w:r>
           </w:p>
         </w:tc>
@@ -1367,7 +2739,7 @@
               <w:rPr>
                 <w:sz w:val="23"/>
               </w:rPr>
-              <w:t>323 người</w:t>
+              <w:t>Đồng sáng lập, Giám đốc tiếp thị</w:t>
             </w:r>
           </w:p>
         </w:tc>
@@ -1380,7 +2752,7 @@
               <w:rPr>
                 <w:sz w:val="23"/>
               </w:rPr>
-              <w:t>58% chi dưới 500.000 đồng/tháng cho thời trang</w:t>
+              <w:t>Chưa có thông tin công khai</w:t>
             </w:r>
           </w:p>
         </w:tc>
@@ -1393,7 +2765,7 @@
               <w:rPr>
                 <w:sz w:val="23"/>
               </w:rPr>
-              <w:t>Ngân sách thời trang thấp, nhạy cảm giá</w:t>
+              <w:t>Từng làm Giám đốc điều hành một công ty dịch vụ tiếp thị trong 2 năm; kinh nghiệm tiếp thị trực tuyến</w:t>
             </w:r>
           </w:p>
         </w:tc>
@@ -1408,7 +2780,7 @@
               <w:rPr>
                 <w:sz w:val="23"/>
               </w:rPr>
-              <w:t>Bộ Công Thương (2019), qua Tuổi Trẻ (2020)</w:t>
+              <w:t>Nguyễn Văn Hiệp</w:t>
             </w:r>
           </w:p>
         </w:tc>
@@ -1421,7 +2793,7 @@
               <w:rPr>
                 <w:sz w:val="23"/>
               </w:rPr>
-              <w:t>Người dùng Internet</w:t>
+              <w:t>Đồng sáng lập, Giám đốc công nghệ</w:t>
             </w:r>
           </w:p>
         </w:tc>
@@ -1434,7 +2806,7 @@
               <w:rPr>
                 <w:sz w:val="23"/>
               </w:rPr>
-              <w:t>77% từng mua hàng trực tuyến; đa số 18–25 tuổi</w:t>
+              <w:t>Chưa có thông tin công khai</w:t>
             </w:r>
           </w:p>
         </w:tc>
@@ -1447,61 +2819,7 @@
               <w:rPr>
                 <w:sz w:val="23"/>
               </w:rPr>
-              <w:t>Kênh trực tuyến đã sẵn sàng</w:t>
-            </w:r>
-          </w:p>
-        </w:tc>
-      </w:tr>
-      <w:tr>
-        <w:tc>
-          <w:tcPr>
-            <w:tcW w:type="dxa" w:w="2160"/>
-          </w:tcPr>
-          <w:p>
-            <w:r>
-              <w:rPr>
-                <w:sz w:val="23"/>
-              </w:rPr>
-              <w:t>Nielsen, qua Brands Vietnam (2018)</w:t>
-            </w:r>
-          </w:p>
-        </w:tc>
-        <w:tc>
-          <w:tcPr>
-            <w:tcW w:type="dxa" w:w="2160"/>
-          </w:tcPr>
-          <w:p>
-            <w:r>
-              <w:rPr>
-                <w:sz w:val="23"/>
-              </w:rPr>
-              <w:t>Người mua sắm trực tuyến</w:t>
-            </w:r>
-          </w:p>
-        </w:tc>
-        <w:tc>
-          <w:tcPr>
-            <w:tcW w:type="dxa" w:w="2160"/>
-          </w:tcPr>
-          <w:p>
-            <w:r>
-              <w:rPr>
-                <w:sz w:val="23"/>
-              </w:rPr>
-              <w:t>60% nữ, 40% nam; lo ngại hàng giả, không được thử</w:t>
-            </w:r>
-          </w:p>
-        </w:tc>
-        <w:tc>
-          <w:tcPr>
-            <w:tcW w:type="dxa" w:w="2160"/>
-          </w:tcPr>
-          <w:p>
-            <w:r>
-              <w:rPr>
-                <w:sz w:val="23"/>
-              </w:rPr>
-              <w:t>Khách nam ít được chú ý; cần giải pháp xóa nỗi sợ mua sai</w:t>
+              <w:t>Từng là trưởng nhóm kỹ thuật (có nguồn ghi là Giám đốc công nghệ) tại Ecomobi; kinh nghiệm lập trình, xây dựng hệ thống</w:t>
             </w:r>
           </w:p>
         </w:tc>
@@ -1515,7 +2833,7 @@
           <w:color w:val="555555"/>
           <w:sz w:val="21"/>
         </w:rPr>
-        <w:t>Nguồn: Q&amp;Me. (2017a). Thói quen mua sắm thời trang của người Việt [Báo cáo nghiên cứu thị trường]. https://qandme.net/vi/baibaocao/thoi-quen-mua-sam-thoi-trang-cua-nguoi-viet.html</w:t>
+        <w:t>Nguồn: Crunchbase. (không ghi ngày). Nhu Pham – CEO &amp; Founder @ COOLMATE. Truy cập ngày 10 tháng 10 năm 2026, tại https://www.crunchbase.com/person/nhu-pham-b90c</w:t>
       </w:r>
     </w:p>
     <w:p>
@@ -1525,7 +2843,7 @@
           <w:color w:val="555555"/>
           <w:sz w:val="21"/>
         </w:rPr>
-        <w:t>Nguồn: Q&amp;Me. (2017b). Các thương hiệu thời trang Việt phổ biến [Báo cáo nghiên cứu thị trường]. https://qandme.net/vi/baibaocao/cac-thuong-hieu-thoi-trang-viet-pho-bien.html</w:t>
+        <w:t>Nguồn: CB Insights. (không ghi ngày). CoolMate – CEO, founder, key executive team. Truy cập ngày 10 tháng 10 năm 2026, tại https://www.cbinsights.com/company/coolmate/people</w:t>
       </w:r>
     </w:p>
     <w:p>
@@ -1535,7 +2853,7 @@
           <w:color w:val="555555"/>
           <w:sz w:val="21"/>
         </w:rPr>
-        <w:t>Nguồn: Tuổi Trẻ. (2020, 18 tháng 8). 77% người xài Internet ở Việt Nam từng mua hàng online. https://tuoitre.vn/77-nguoi-xai-internet-o-viet-nam-tung-mua-hang-online-2020081817282187.htm</w:t>
+        <w:t>Nguồn: Vietcetera. (2020). A brand’s story: Coolmate – A smart solution for the male wardrobe. https://vietcetera.com/en/a-brands-story-coolmate--a-smart-solution-for-the-male-wardrobe</w:t>
       </w:r>
     </w:p>
     <w:p>
@@ -1545,29 +2863,7 @@
           <w:color w:val="555555"/>
           <w:sz w:val="21"/>
         </w:rPr>
-        <w:t>Nguồn: Brands Vietnam. (2018). Nielsen: Thương mại điện tử Việt Nam có thể đạt 10 tỷ USD. https://www.brandsvietnam.com/17321-Nielsen-Thuong-mai-dien-tu-Viet-Nam-co-the-dat-10-ty-USD</w:t>
-      </w:r>
-    </w:p>
-    <w:p>
-      <w:pPr>
-        <w:jc w:val="both"/>
-      </w:pPr>
-      <w:r>
-        <w:rPr>
-          <w:i w:val="0"/>
-        </w:rPr>
-        <w:t>b) Dữ liệu thị trường: mua sắm trực tuyến bùng nổ năm 2019</w:t>
-      </w:r>
-    </w:p>
-    <w:p>
-      <w:pPr>
-        <w:jc w:val="both"/>
-      </w:pPr>
-      <w:r>
-        <w:rPr>
-          <w:i w:val="0"/>
-        </w:rPr>
-        <w:t>Theo Sách trắng thương mại điện tử của Bộ Công Thương, doanh số bán lẻ thương mại điện tử từ doanh nghiệp tới người tiêu dùng năm 2019 đạt khoảng 10,08 tỷ đô la Mỹ, chiếm 4,9% tổng mức bán lẻ hàng hóa và dịch vụ tiêu dùng (Tạp chí Công Thương, 2020). Có khoảng 44,8 triệu người mua sắm trực tuyến, chi trung bình khoảng 225 đô la Mỹ mỗi người trong năm (VnBusiness, 2020). Báo cáo e-Conomy SEA 2019 ước tính kinh tế Internet Việt Nam đạt khoảng 12 tỷ đô la Mỹ, tăng khoảng 38–39% mỗi năm giai đoạn 2015–2019 (Tuổi Trẻ News, 2019).</w:t>
+        <w:t>Nguồn: Vertex Ventures. (2024). Coolmate wants to be Vietnam’s next unicorn. https://www.vertexventures.sg/news/coolmate-wants-to-be-vietnams-next-unicorn/</w:t>
       </w:r>
     </w:p>
     <w:p>
@@ -1577,7 +2873,7 @@
           <w:color w:val="555555"/>
           <w:sz w:val="21"/>
         </w:rPr>
-        <w:t>Nguồn: Tạp chí Công Thương. (2020). Năm 2019, doanh số bán lẻ thương mại điện tử B2C đạt trên 10 tỷ USD. https://tapchicongthuong.vn/nam-2019--doanh-so-ban-le-thuong-mai-dien-tu-b2c-dat-tren-10-ty-usd-74423.htm</w:t>
+        <w:t>Nguồn: The Org. (không ghi ngày). Xuan Lan Nguyen Hoai – Co-Founder and Marketing Director at Coolmate. Truy cập ngày 10 tháng 10 năm 2026, tại https://theorg.com/org/coolmate/org-chart/xuan-lan-nguyen-hoai</w:t>
       </w:r>
     </w:p>
     <w:p>
@@ -1587,7 +2883,7 @@
           <w:color w:val="555555"/>
           <w:sz w:val="21"/>
         </w:rPr>
-        <w:t>Nguồn: VnBusiness. (2020). Hơn 44 triệu người dân Việt Nam tham gia mua sắm trực tuyến. https://vnbusiness.vn/hon-44-trieu-nguoi-dan-viet-nam-tham-gia-mua-sam-truc-tuyen.html</w:t>
+        <w:t>Nguồn: CafeBiz. (2021, 4 tháng 5). Chân dung startup Coolmate vừa gọi vốn thành công 500.000 USD trên Shark Tank. https://cafebiz.vn/chan-dung-startup-coolmate-vua-goi-von-thanh-cong-500000-usd-tren-shark-tank-tung-di-thi-khoi-nghiep-chi-lot-top-10-nay-da-la-ong-trum-ban-chuc-nghin-don-tren-shopee-20210504091320202.chn</w:t>
       </w:r>
     </w:p>
     <w:p>
@@ -1597,7 +2893,131 @@
           <w:color w:val="555555"/>
           <w:sz w:val="21"/>
         </w:rPr>
-        <w:t>Nguồn: Tuổi Trẻ News. (2019, 4 tháng 10). Vietnam, Indonesia lead ASEAN in internet economy growth: Google report. https://tuoitrenews.vn/news/business/20191004/vietnam-indonesia-lead-asean-in-internet-economy-growth-google-report/51454.html</w:t>
+        <w:t>Nguồn: Forbes Việt Nam. (2022). Startup thời trang không có cửa hàng, không có nhà máy, chỉ bán online. https://forbes.vn/startup-thoi-trang-noi-khong-voi-mo-cua-hang/</w:t>
+      </w:r>
+    </w:p>
+    <w:p>
+      <w:pPr>
+        <w:jc w:val="both"/>
+      </w:pPr>
+      <w:r>
+        <w:rPr>
+          <w:i w:val="0"/>
+        </w:rPr>
+        <w:t>Ông Phạm Chí Nhu: kinh nghiệm kiểm toán giúp ông có tư duy tài chính, còn thời gian quản lý trang thương mại điện tử thời trang và tự bán hàng trên Shopee giúp ông hiểu cả chuỗi giá trị lẫn hạn chế của mô hình bán qua sàn – từ đó hình thành ý tưởng bán trực tiếp (Vietcetera, 2020; Vertex Ventures, 2024). Ông theo học Đại học Ngoại thương (Crunchbase, không ghi ngày); hồ sơ CB Insights liệt kê Deloitte và adidas trong quá trình làm việc trước đây (CB Insights, không ghi ngày).</w:t>
+      </w:r>
+    </w:p>
+    <w:p>
+      <w:r>
+        <w:rPr>
+          <w:i/>
+          <w:color w:val="555555"/>
+          <w:sz w:val="21"/>
+        </w:rPr>
+        <w:t>Nguồn: Vietcetera. (2020). A brand’s story: Coolmate – A smart solution for the male wardrobe. https://vietcetera.com/en/a-brands-story-coolmate--a-smart-solution-for-the-male-wardrobe</w:t>
+      </w:r>
+    </w:p>
+    <w:p>
+      <w:r>
+        <w:rPr>
+          <w:i/>
+          <w:color w:val="555555"/>
+          <w:sz w:val="21"/>
+        </w:rPr>
+        <w:t>Nguồn: Vertex Ventures. (2024). Coolmate wants to be Vietnam’s next unicorn. https://www.vertexventures.sg/news/coolmate-wants-to-be-vietnams-next-unicorn/</w:t>
+      </w:r>
+    </w:p>
+    <w:p>
+      <w:r>
+        <w:rPr>
+          <w:i/>
+          <w:color w:val="555555"/>
+          <w:sz w:val="21"/>
+        </w:rPr>
+        <w:t>Nguồn: Crunchbase. (không ghi ngày). Nhu Pham – CEO &amp; Founder @ COOLMATE. Truy cập ngày 10 tháng 10 năm 2026, tại https://www.crunchbase.com/person/nhu-pham-b90c</w:t>
+      </w:r>
+    </w:p>
+    <w:p>
+      <w:r>
+        <w:rPr>
+          <w:i/>
+          <w:color w:val="555555"/>
+          <w:sz w:val="21"/>
+        </w:rPr>
+        <w:t>Nguồn: CB Insights. (không ghi ngày). CoolMate – CEO, founder, key executive team. Truy cập ngày 10 tháng 10 năm 2026, tại https://www.cbinsights.com/company/coolmate/people</w:t>
+      </w:r>
+    </w:p>
+    <w:p>
+      <w:pPr>
+        <w:jc w:val="both"/>
+      </w:pPr>
+      <w:r>
+        <w:rPr>
+          <w:i w:val="0"/>
+        </w:rPr>
+        <w:t>Bà Nguyễn Hoài Xuân Lan: từng làm Giám đốc điều hành một công ty dịch vụ tiếp thị trong khoảng 2 năm, có kinh nghiệm tiếp thị trực tuyến (CafeBiz, 2021). Đây là năng lực quan trọng với một thương hiệu chỉ bán qua mạng ở giai đoạn đầu.</w:t>
+      </w:r>
+    </w:p>
+    <w:p>
+      <w:r>
+        <w:rPr>
+          <w:i/>
+          <w:color w:val="555555"/>
+          <w:sz w:val="21"/>
+        </w:rPr>
+        <w:t>Nguồn: CafeBiz. (2021, 4 tháng 5). Chân dung startup Coolmate vừa gọi vốn thành công 500.000 USD trên Shark Tank. https://cafebiz.vn/chan-dung-startup-coolmate-vua-goi-von-thanh-cong-500000-usd-tren-shark-tank-tung-di-thi-khoi-nghiep-chi-lot-top-10-nay-da-la-ong-trum-ban-chuc-nghin-don-tren-shopee-20210504091320202.chn</w:t>
+      </w:r>
+    </w:p>
+    <w:p>
+      <w:r>
+        <w:rPr>
+          <w:i/>
+          <w:color w:val="555555"/>
+          <w:sz w:val="21"/>
+        </w:rPr>
+        <w:t>Nguồn: The Org. (không ghi ngày). Xuan Lan Nguyen Hoai – Co-Founder and Marketing Director at Coolmate. Truy cập ngày 10 tháng 10 năm 2026, tại https://theorg.com/org/coolmate/org-chart/xuan-lan-nguyen-hoai</w:t>
+      </w:r>
+    </w:p>
+    <w:p>
+      <w:pPr>
+        <w:jc w:val="both"/>
+      </w:pPr>
+      <w:r>
+        <w:rPr>
+          <w:i w:val="0"/>
+        </w:rPr>
+        <w:t>Ông Nguyễn Văn Hiệp: từng là trưởng nhóm kỹ thuật tại Ecomobi (CafeBiz, 2021; Forbes Việt Nam, 2022). Ông chủ trương tự xây dựng hệ thống quản trị doanh nghiệp nội bộ thay vì dùng phần mềm bên thứ ba, vì cho rằng như vậy Coolmate mới kiểm soát được hệ thống (Forbes Việt Nam, 2022).</w:t>
+      </w:r>
+    </w:p>
+    <w:p>
+      <w:r>
+        <w:rPr>
+          <w:i/>
+          <w:color w:val="555555"/>
+          <w:sz w:val="21"/>
+        </w:rPr>
+        <w:t>Nguồn: CafeBiz. (2021, 4 tháng 5). Chân dung startup Coolmate vừa gọi vốn thành công 500.000 USD trên Shark Tank. https://cafebiz.vn/chan-dung-startup-coolmate-vua-goi-von-thanh-cong-500000-usd-tren-shark-tank-tung-di-thi-khoi-nghiep-chi-lot-top-10-nay-da-la-ong-trum-ban-chuc-nghin-don-tren-shopee-20210504091320202.chn</w:t>
+      </w:r>
+    </w:p>
+    <w:p>
+      <w:r>
+        <w:rPr>
+          <w:i/>
+          <w:color w:val="555555"/>
+          <w:sz w:val="21"/>
+        </w:rPr>
+        <w:t>Nguồn: Forbes Việt Nam. (2022). Startup thời trang không có cửa hàng, không có nhà máy, chỉ bán online. https://forbes.vn/startup-thoi-trang-noi-khong-voi-mo-cua-hang/</w:t>
+      </w:r>
+    </w:p>
+    <w:p>
+      <w:pPr>
+        <w:jc w:val="both"/>
+      </w:pPr>
+      <w:r>
+        <w:rPr>
+          <w:i w:val="0"/>
+        </w:rPr>
+        <w:t>b) Sự bổ trợ của đội ngũ</w:t>
       </w:r>
     </w:p>
     <w:p>
@@ -1609,7 +3029,7 @@
           <w:b/>
           <w:i/>
         </w:rPr>
-        <w:t>Bảng 5. Dữ liệu thị trường trực tuyến năm 2019</w:t>
+        <w:t>Bảng 8. Mức độ bổ trợ của nhóm sáng lập</w:t>
       </w:r>
     </w:p>
     <w:tbl>
@@ -1636,7 +3056,7 @@
                 <w:color w:val="FFFFFF"/>
                 <w:sz w:val="23"/>
               </w:rPr>
-              <w:t>Chỉ báo thị trường (2019)</w:t>
+              <w:t>Năng lực cần có của thương hiệu bán trực tiếp</w:t>
             </w:r>
           </w:p>
         </w:tc>
@@ -1652,7 +3072,7 @@
                 <w:color w:val="FFFFFF"/>
                 <w:sz w:val="23"/>
               </w:rPr>
-              <w:t>Giá trị</w:t>
+              <w:t>Người đảm nhận</w:t>
             </w:r>
           </w:p>
         </w:tc>
@@ -1668,7 +3088,7 @@
                 <w:color w:val="FFFFFF"/>
                 <w:sz w:val="23"/>
               </w:rPr>
-              <w:t>Nguồn</w:t>
+              <w:t>Bằng chứng</w:t>
             </w:r>
           </w:p>
         </w:tc>
@@ -1683,7 +3103,7 @@
               <w:rPr>
                 <w:sz w:val="23"/>
               </w:rPr>
-              <w:t>Doanh số bán lẻ thương mại điện tử B2C</w:t>
+              <w:t>Sản phẩm, tài chính, chiến lược, gọi vốn</w:t>
             </w:r>
           </w:p>
         </w:tc>
@@ -1696,7 +3116,7 @@
               <w:rPr>
                 <w:sz w:val="23"/>
               </w:rPr>
-              <w:t>Khoảng 10,08 tỷ đô la Mỹ</w:t>
+              <w:t>Phạm Chí Nhu</w:t>
             </w:r>
           </w:p>
         </w:tc>
@@ -1709,7 +3129,7 @@
               <w:rPr>
                 <w:sz w:val="23"/>
               </w:rPr>
-              <w:t>Tạp chí Công Thương (2020)</w:t>
+              <w:t>Kinh nghiệm kiểm toán, thương mại điện tử thời trang; dẫn dắt nhiều vòng gọi vốn</w:t>
             </w:r>
           </w:p>
         </w:tc>
@@ -1724,7 +3144,7 @@
               <w:rPr>
                 <w:sz w:val="23"/>
               </w:rPr>
-              <w:t>Tỷ trọng trong tổng bán lẻ</w:t>
+              <w:t>Thu hút khách hàng</w:t>
             </w:r>
           </w:p>
         </w:tc>
@@ -1737,7 +3157,7 @@
               <w:rPr>
                 <w:sz w:val="23"/>
               </w:rPr>
-              <w:t>4,9%</w:t>
+              <w:t>Nguyễn Hoài Xuân Lan</w:t>
             </w:r>
           </w:p>
         </w:tc>
@@ -1750,7 +3170,7 @@
               <w:rPr>
                 <w:sz w:val="23"/>
               </w:rPr>
-              <w:t>Tạp chí Công Thương (2020)</w:t>
+              <w:t>Kinh nghiệm điều hành công ty tiếp thị</w:t>
             </w:r>
           </w:p>
         </w:tc>
@@ -1765,7 +3185,7 @@
               <w:rPr>
                 <w:sz w:val="23"/>
               </w:rPr>
-              <w:t>Số người mua sắm trực tuyến</w:t>
+              <w:t>Nền tảng công nghệ, dữ liệu</w:t>
             </w:r>
           </w:p>
         </w:tc>
@@ -1778,7 +3198,7 @@
               <w:rPr>
                 <w:sz w:val="23"/>
               </w:rPr>
-              <w:t>Khoảng 44,8 triệu</w:t>
+              <w:t>Nguyễn Văn Hiệp</w:t>
             </w:r>
           </w:p>
         </w:tc>
@@ -1791,89 +3211,7 @@
               <w:rPr>
                 <w:sz w:val="23"/>
               </w:rPr>
-              <w:t>VnBusiness (2020)</w:t>
-            </w:r>
-          </w:p>
-        </w:tc>
-      </w:tr>
-      <w:tr>
-        <w:tc>
-          <w:tcPr>
-            <w:tcW w:type="dxa" w:w="2880"/>
-          </w:tcPr>
-          <w:p>
-            <w:r>
-              <w:rPr>
-                <w:sz w:val="23"/>
-              </w:rPr>
-              <w:t>Chi tiêu bình quân mỗi người</w:t>
-            </w:r>
-          </w:p>
-        </w:tc>
-        <w:tc>
-          <w:tcPr>
-            <w:tcW w:type="dxa" w:w="2880"/>
-          </w:tcPr>
-          <w:p>
-            <w:r>
-              <w:rPr>
-                <w:sz w:val="23"/>
-              </w:rPr>
-              <w:t>Khoảng 225 đô la Mỹ/năm</w:t>
-            </w:r>
-          </w:p>
-        </w:tc>
-        <w:tc>
-          <w:tcPr>
-            <w:tcW w:type="dxa" w:w="2880"/>
-          </w:tcPr>
-          <w:p>
-            <w:r>
-              <w:rPr>
-                <w:sz w:val="23"/>
-              </w:rPr>
-              <w:t>VnBusiness (2020)</w:t>
-            </w:r>
-          </w:p>
-        </w:tc>
-      </w:tr>
-      <w:tr>
-        <w:tc>
-          <w:tcPr>
-            <w:tcW w:type="dxa" w:w="2880"/>
-          </w:tcPr>
-          <w:p>
-            <w:r>
-              <w:rPr>
-                <w:sz w:val="23"/>
-              </w:rPr>
-              <w:t>Tăng trưởng kinh tế Internet 2015–2019</w:t>
-            </w:r>
-          </w:p>
-        </w:tc>
-        <w:tc>
-          <w:tcPr>
-            <w:tcW w:type="dxa" w:w="2880"/>
-          </w:tcPr>
-          <w:p>
-            <w:r>
-              <w:rPr>
-                <w:sz w:val="23"/>
-              </w:rPr>
-              <w:t>Khoảng 38–39%/năm</w:t>
-            </w:r>
-          </w:p>
-        </w:tc>
-        <w:tc>
-          <w:tcPr>
-            <w:tcW w:type="dxa" w:w="2880"/>
-          </w:tcPr>
-          <w:p>
-            <w:r>
-              <w:rPr>
-                <w:sz w:val="23"/>
-              </w:rPr>
-              <w:t>Tuổi Trẻ News (2019)</w:t>
+              <w:t>Kinh nghiệm kỹ thuật tại Ecomobi; xây hệ thống nội bộ</w:t>
             </w:r>
           </w:p>
         </w:tc>
@@ -1888,7 +3226,7 @@
         <w:rPr>
           <w:i w:val="0"/>
         </w:rPr>
-        <w:t>c) Nhu cầu được nhà sáng lập phát hiện như thế nào</w:t>
+        <w:t>c) Bằng chứng về năng lực thực thi</w:t>
       </w:r>
     </w:p>
     <w:p>
@@ -1899,7 +3237,34 @@
         <w:rPr>
           <w:i w:val="0"/>
         </w:rPr>
-        <w:t>Ông Phạm Chí Nhu từng làm trong ngành kiểm toán và quản lý trang thương mại điện tử của một thương hiệu thời trang; trải nghiệm này khiến ông băn khoăn vì sao quần áo cùng chất lượng ở Việt Nam lại có giá chênh lệch nhiều so với Singapore (Vietcetera, 2020). Ông cũng từng bán quần áo trên Shopee và nhận ra phí sàn ăn mòn lợi nhuận, nên chuyển sang mô hình bán trực tiếp (Vertex Ventures, 2024).</w:t>
+        <w:t>Khởi đầu từ một nhà kho khoảng 20 mét vuông năm 2019, đội ngũ đã:</w:t>
+      </w:r>
+    </w:p>
+    <w:p>
+      <w:pPr>
+        <w:pStyle w:val="ListBullet"/>
+        <w:jc w:val="both"/>
+      </w:pPr>
+      <w:r>
+        <w:t>Gọi vốn thành công 500.000 đô la Mỹ trên chương trình Shark Tank Việt Nam năm 2021, đổi lấy 10% cổ phần cùng 2,5% cổ phần cố vấn; sau chương trình, trang mạng đạt kỷ lục khoảng 1 triệu lượt truy cập mỗi tháng (CafeBiz, 2021; Brands Vietnam, 2021).</w:t>
+      </w:r>
+    </w:p>
+    <w:p>
+      <w:pPr>
+        <w:pStyle w:val="ListBullet"/>
+        <w:jc w:val="both"/>
+      </w:pPr>
+      <w:r>
+        <w:t>Tăng doanh thu từ 39 tỷ đồng (2020) lên 363 tỷ đồng (2023) theo số liệu doanh nghiệp công bố (Coolmate, không ghi ngày-a).</w:t>
+      </w:r>
+    </w:p>
+    <w:p>
+      <w:pPr>
+        <w:pStyle w:val="ListBullet"/>
+        <w:jc w:val="both"/>
+      </w:pPr>
+      <w:r>
+        <w:t>Thuyết phục nhiều quỹ đầu tư qua các vòng: GSR Ventures (2022), Vertex Ventures và Kairous Capital (2024), Vertex Growth, Cool Japan Fund, YoungOne CVC (2025).</w:t>
       </w:r>
     </w:p>
     <w:p>
@@ -1909,7 +3274,7 @@
           <w:color w:val="555555"/>
           <w:sz w:val="21"/>
         </w:rPr>
-        <w:t>Nguồn: Vietcetera. (2020). A brand’s story: Coolmate – A smart solution for the male wardrobe. https://vietcetera.com/en/a-brands-story-coolmate--a-smart-solution-for-the-male-wardrobe</w:t>
+        <w:t>Nguồn: CafeBiz. (2021, 4 tháng 5). Chân dung startup Coolmate vừa gọi vốn thành công 500.000 USD trên Shark Tank. https://cafebiz.vn/chan-dung-startup-coolmate-vua-goi-von-thanh-cong-500000-usd-tren-shark-tank-tung-di-thi-khoi-nghiep-chi-lot-top-10-nay-da-la-ong-trum-ban-chuc-nghin-don-tren-shopee-20210504091320202.chn</w:t>
       </w:r>
     </w:p>
     <w:p>
@@ -1919,18 +3284,47 @@
           <w:color w:val="555555"/>
           <w:sz w:val="21"/>
         </w:rPr>
-        <w:t>Nguồn: Vertex Ventures. (2024). Coolmate wants to be Vietnam’s next unicorn. https://www.vertexventures.sg/news/coolmate-wants-to-be-vietnams-next-unicorn/</w:t>
+        <w:t>Nguồn: Brands Vietnam. (2021). Sau Shark Tank, Coolmate đạt kỷ lục 1 triệu traffic/tháng. https://www.brandsvietnam.com/22165-Sau-Shark-Tank-Coolmate-dat-ky-luc-1-trieu-traffic-thang</w:t>
       </w:r>
     </w:p>
     <w:p>
-      <w:pPr>
-        <w:jc w:val="both"/>
-      </w:pPr>
       <w:r>
         <w:rPr>
-          <w:i w:val="0"/>
+          <w:i/>
+          <w:color w:val="555555"/>
+          <w:sz w:val="21"/>
         </w:rPr>
-        <w:t>d) Các điểm đau của khách hàng nam năm 2019</w:t>
+        <w:t>Nguồn: Coolmate. (không ghi ngày-a). Coolmate 101: Hành trình và các cột mốc phát triển. Truy cập ngày 10 tháng 10 năm 2026, tại https://www.coolmate.me/lp/coolmate-101</w:t>
+      </w:r>
+    </w:p>
+    <w:p>
+      <w:r>
+        <w:rPr>
+          <w:i/>
+          <w:color w:val="555555"/>
+          <w:sz w:val="21"/>
+        </w:rPr>
+        <w:t>Nguồn: Brands Vietnam. (2022). Coolmate vừa nhận thêm 2,3 triệu USD cho vòng Series A từ GSR Ventures. https://www.brandsvietnam.com/23086-Coolmate-vua-nhan-them-2-3-trieu-USD-cho-vong-Series-A-tu-GSR-Ventures</w:t>
+      </w:r>
+    </w:p>
+    <w:p>
+      <w:r>
+        <w:rPr>
+          <w:i/>
+          <w:color w:val="555555"/>
+          <w:sz w:val="21"/>
+        </w:rPr>
+        <w:t>Nguồn: The Leader. (2024). Coolmate gọi vốn 6 triệu USD, tham vọng xuất hàng sang Mỹ. https://theleader.vn/coolmate-goi-von-6-trieu-usd-tham-vong-xuat-hang-sang-my-d37758.html</w:t>
+      </w:r>
+    </w:p>
+    <w:p>
+      <w:r>
+        <w:rPr>
+          <w:i/>
+          <w:color w:val="555555"/>
+          <w:sz w:val="21"/>
+        </w:rPr>
+        <w:t>Nguồn: Coolmate. (2025, ngày 3 tháng 11). Coolmate gọi vốn thành công vòng đầu tư tăng trưởng, mở ra chương mới cho thương hiệu Việt. https://www.coolmate.me/blog/coolmate-goi-von-thanh-cong-series-c-mo-ra-chuong-moi-cho-thuong-hieu-viet</w:t>
       </w:r>
     </w:p>
     <w:p>
@@ -1942,7 +3336,7 @@
           <w:b/>
           <w:i/>
         </w:rPr>
-        <w:t>Bảng 6. Điểm đau của khách hàng khi Coolmate khởi nghiệp</w:t>
+        <w:t>Bảng 9. Doanh thu Coolmate giai đoạn 2020–2023</w:t>
       </w:r>
     </w:p>
     <w:tbl>
@@ -1969,7 +3363,7 @@
                 <w:color w:val="FFFFFF"/>
                 <w:sz w:val="23"/>
               </w:rPr>
-              <w:t>Điểm đau</w:t>
+              <w:t>Năm</w:t>
             </w:r>
           </w:p>
         </w:tc>
@@ -1985,7 +3379,7 @@
                 <w:color w:val="FFFFFF"/>
                 <w:sz w:val="23"/>
               </w:rPr>
-              <w:t>Bằng chứng</w:t>
+              <w:t>Doanh thu công bố</w:t>
             </w:r>
           </w:p>
         </w:tc>
@@ -2001,7 +3395,7 @@
                 <w:color w:val="FFFFFF"/>
                 <w:sz w:val="23"/>
               </w:rPr>
-              <w:t>Mức độ</w:t>
+              <w:t>Tăng so với năm trước (người viết tính)</w:t>
             </w:r>
           </w:p>
         </w:tc>
@@ -2016,7 +3410,7 @@
               <w:rPr>
                 <w:sz w:val="23"/>
               </w:rPr>
-              <w:t>Ngân sách thời trang thấp, cần giá phổ thông</w:t>
+              <w:t>2020</w:t>
             </w:r>
           </w:p>
         </w:tc>
@@ -2029,7 +3423,7 @@
               <w:rPr>
                 <w:sz w:val="23"/>
               </w:rPr>
-              <w:t>Khoảng 50–58% chi dưới 300.000–500.000 đồng/tháng (Q&amp;Me, 2017a, 2017b)</w:t>
+              <w:t>39 tỷ đồng</w:t>
             </w:r>
           </w:p>
         </w:tc>
@@ -2042,7 +3436,7 @@
               <w:rPr>
                 <w:sz w:val="23"/>
               </w:rPr>
-              <w:t>Cao</w:t>
+              <w:t>–</w:t>
             </w:r>
           </w:p>
         </w:tc>
@@ -2057,7 +3451,7 @@
               <w:rPr>
                 <w:sz w:val="23"/>
               </w:rPr>
-              <w:t>Sợ hàng giả, hàng không giống mô tả</w:t>
+              <w:t>2021</w:t>
             </w:r>
           </w:p>
         </w:tc>
@@ -2070,7 +3464,7 @@
               <w:rPr>
                 <w:sz w:val="23"/>
               </w:rPr>
-              <w:t>Rào cản lớn nhất khi mua trực tuyến (Brands Vietnam, 2018)</w:t>
+              <w:t>137 tỷ đồng</w:t>
             </w:r>
           </w:p>
         </w:tc>
@@ -2083,7 +3477,7 @@
               <w:rPr>
                 <w:sz w:val="23"/>
               </w:rPr>
-              <w:t>Cao</w:t>
+              <w:t>Khoảng 251,3%</w:t>
             </w:r>
           </w:p>
         </w:tc>
@@ -2098,7 +3492,7 @@
               <w:rPr>
                 <w:sz w:val="23"/>
               </w:rPr>
-              <w:t>Không được thử, sợ mua sai kích cỡ</w:t>
+              <w:t>2022</w:t>
             </w:r>
           </w:p>
         </w:tc>
@@ -2111,7 +3505,7 @@
               <w:rPr>
                 <w:sz w:val="23"/>
               </w:rPr>
-              <w:t>Người mua muốn chạm, thử trước khi mua (Brands Vietnam, 2018)</w:t>
+              <w:t>292,8 tỷ đồng</w:t>
             </w:r>
           </w:p>
         </w:tc>
@@ -2124,7 +3518,7 @@
               <w:rPr>
                 <w:sz w:val="23"/>
               </w:rPr>
-              <w:t>Cao</w:t>
+              <w:t>Khoảng 113,7%</w:t>
             </w:r>
           </w:p>
         </w:tc>
@@ -2139,7 +3533,7 @@
               <w:rPr>
                 <w:sz w:val="23"/>
               </w:rPr>
-              <w:t>Khách nam ít được các thương hiệu chú ý</w:t>
+              <w:t>2023</w:t>
             </w:r>
           </w:p>
         </w:tc>
@@ -2152,7 +3546,7 @@
               <w:rPr>
                 <w:sz w:val="23"/>
               </w:rPr>
-              <w:t>Nam chỉ chiếm 40% người mua trực tuyến (Brands Vietnam, 2018)</w:t>
+              <w:t>363 tỷ đồng</w:t>
             </w:r>
           </w:p>
         </w:tc>
@@ -2165,1373 +3559,13 @@
               <w:rPr>
                 <w:sz w:val="23"/>
               </w:rPr>
-              <w:t>Trung bình</w:t>
+              <w:t>Khoảng 24,0%</w:t>
             </w:r>
           </w:p>
         </w:tc>
       </w:tr>
     </w:tbl>
     <w:p/>
-    <w:p>
-      <w:r>
-        <w:rPr>
-          <w:i/>
-          <w:color w:val="555555"/>
-          <w:sz w:val="21"/>
-        </w:rPr>
-        <w:t>Nguồn: Q&amp;Me. (2017a). Thói quen mua sắm thời trang của người Việt [Báo cáo nghiên cứu thị trường]. https://qandme.net/vi/baibaocao/thoi-quen-mua-sam-thoi-trang-cua-nguoi-viet.html</w:t>
-      </w:r>
-    </w:p>
-    <w:p>
-      <w:r>
-        <w:rPr>
-          <w:i/>
-          <w:color w:val="555555"/>
-          <w:sz w:val="21"/>
-        </w:rPr>
-        <w:t>Nguồn: Q&amp;Me. (2017b). Các thương hiệu thời trang Việt phổ biến [Báo cáo nghiên cứu thị trường]. https://qandme.net/vi/baibaocao/cac-thuong-hieu-thoi-trang-viet-pho-bien.html</w:t>
-      </w:r>
-    </w:p>
-    <w:p>
-      <w:r>
-        <w:rPr>
-          <w:i/>
-          <w:color w:val="555555"/>
-          <w:sz w:val="21"/>
-        </w:rPr>
-        <w:t>Nguồn: Brands Vietnam. (2018). Nielsen: Thương mại điện tử Việt Nam có thể đạt 10 tỷ USD. https://www.brandsvietnam.com/17321-Nielsen-Thuong-mai-dien-tu-Viet-Nam-co-the-dat-10-ty-USD</w:t>
-      </w:r>
-    </w:p>
-    <w:p>
-      <w:pPr>
-        <w:jc w:val="both"/>
-      </w:pPr>
-      <w:r>
-        <w:rPr>
-          <w:i w:val="0"/>
-        </w:rPr>
-        <w:t>e) Kiểm chứng bằng dữ liệu các năm sau</w:t>
-      </w:r>
-    </w:p>
-    <w:p>
-      <w:pPr>
-        <w:jc w:val="both"/>
-      </w:pPr>
-      <w:r>
-        <w:rPr>
-          <w:i w:val="0"/>
-        </w:rPr>
-        <w:t>Khảo sát của Q&amp;Me năm 2025 cho thấy 49% nam giới mua quần áo, phụ kiện trực tuyến (so với 62% ở nữ) (CASK Vietnam, 2025); khảo sát 1.305 người trên nền tảng Cốc Cốc ghi nhận nam giới tập trung vào đồ thiết yếu như quần áo, giày dép (Brands Vietnam, 2024). Riêng Coolmate bán gần 2 triệu chiếc quần lót trong năm 2024 (Tuổi Trẻ, 2025) và hơn 5,7 triệu sản phẩm cho khoảng 1,2 triệu khách năm 2025 (Bùi, 2026) – bằng chứng rằng nhu cầu đồ thiết yếu của nam giới là có thật và lặp lại thường xuyên.</w:t>
-      </w:r>
-    </w:p>
-    <w:p>
-      <w:r>
-        <w:rPr>
-          <w:i/>
-          <w:color w:val="555555"/>
-          <w:sz w:val="21"/>
-        </w:rPr>
-        <w:t>Nguồn: CASK Vietnam. (2025). Người Việt đang đổ tiền mua gì nhiều nhất trên online? https://www.cask.vn/ecommerce/nguoi-viet-mua-gi-nhieu-nhat-online-2025/</w:t>
-      </w:r>
-    </w:p>
-    <w:p>
-      <w:r>
-        <w:rPr>
-          <w:i/>
-          <w:color w:val="555555"/>
-          <w:sz w:val="21"/>
-        </w:rPr>
-        <w:t>Nguồn: Brands Vietnam. (2024). Chuyện mua sắm thời trang của người Việt. https://www.brandsvietnam.com/congdong/topic/chuyen-mua-sam-thoi-trang-cua-nguoi-viet</w:t>
-      </w:r>
-    </w:p>
-    <w:p>
-      <w:r>
-        <w:rPr>
-          <w:i/>
-          <w:color w:val="555555"/>
-          <w:sz w:val="21"/>
-        </w:rPr>
-        <w:t>Nguồn: Tuổi Trẻ. (2025, 7 tháng 1). Start-up bán gần 2 triệu chiếc quần lót năm 2024 tham vọng thành “kỳ lân”. https://tuoitre.vn/startup-ban-gan-2-trieu-chiec-quan-lot-nam-2024-tham-vong-thanh-ky-lan-20250107183310267.htm</w:t>
-      </w:r>
-    </w:p>
-    <w:p>
-      <w:r>
-        <w:rPr>
-          <w:i/>
-          <w:color w:val="555555"/>
-          <w:sz w:val="21"/>
-        </w:rPr>
-        <w:t>Nguồn: Bùi, N. (2026, ngày 25 tháng 2). Phạm Chí Nhu, nhà sáng lập Coolmate: Thế giới đã chọn Việt Nam, không lẽ doanh nghiệp lại thiếu tự tin. Liên đoàn Thương mại và Công nghiệp Việt Nam. https://vcci.com.vn/news/pham-chi-nhu-ceo-nha-sang-lap-coolmate-the-gioi-da-chon-viet-nam-khong-le-doanh-nghiep-lai-thieu-tu-tin</w:t>
-      </w:r>
-    </w:p>
-    <w:p>
-      <w:pPr>
-        <w:jc w:val="both"/>
-      </w:pPr>
-      <w:r>
-        <w:rPr>
-          <w:i w:val="0"/>
-        </w:rPr>
-        <w:t>f) Hạn chế</w:t>
-      </w:r>
-    </w:p>
-    <w:p>
-      <w:pPr>
-        <w:jc w:val="both"/>
-      </w:pPr>
-      <w:r>
-        <w:rPr>
-          <w:i w:val="0"/>
-        </w:rPr>
-        <w:t>Các khảo sát năm 2017–2019 không tách riêng số liệu nam giới mua đồ cơ bản; người viết phải suy luận từ dữ liệu thời trang chung và tỷ lệ nam trong người mua trực tuyến. Ngoài ra, ngân sách thời trang thấp cho thấy khách hàng rất nhạy cảm giá – dễ chuyển sang nhà bán rẻ hơn.</w:t>
-      </w:r>
-    </w:p>
-    <w:p>
-      <w:pPr>
-        <w:jc w:val="both"/>
-      </w:pPr>
-      <w:r>
-        <w:rPr>
-          <w:b/>
-        </w:rPr>
-        <w:t xml:space="preserve">Đánh giá: </w:t>
-      </w:r>
-      <w:r>
-        <w:rPr>
-          <w:i w:val="0"/>
-        </w:rPr>
-        <w:t>Dữ liệu khảo sát và thị trường đều cho thấy nhu cầu mua thời trang giá phổ thông, tiện lợi, đáng tin cậy là có thật và lớn tại thời điểm năm 2019, trong khi khách nam còn ít được chú ý. Chấm 4/5 vì chưa có khảo sát riêng về nam giới mua đồ cơ bản ở giai đoạn này và khách hàng rất nhạy cảm giá.</w:t>
-      </w:r>
-    </w:p>
-    <w:p>
-      <w:pPr>
-        <w:pStyle w:val="Heading2"/>
-      </w:pPr>
-      <w:r>
-        <w:rPr>
-          <w:rFonts w:ascii="Times New Roman" w:hAnsi="Times New Roman"/>
-          <w:color w:val="1F3A60"/>
-        </w:rPr>
-        <w:t>2. Giải pháp – 4/5</w:t>
-      </w:r>
-    </w:p>
-    <w:p>
-      <w:pPr>
-        <w:jc w:val="both"/>
-      </w:pPr>
-      <w:r>
-        <w:rPr>
-          <w:b/>
-        </w:rPr>
-        <w:t xml:space="preserve">Câu hỏi đặt ra: </w:t>
-      </w:r>
-      <w:r>
-        <w:rPr>
-          <w:i/>
-        </w:rPr>
-        <w:t>Sản phẩm và cách phục vụ của Coolmate có giải quyết đúng các điểm đau không? Khác biệt ở đâu? Lợi thế giữ được đến mức nào?</w:t>
-      </w:r>
-    </w:p>
-    <w:p>
-      <w:pPr>
-        <w:jc w:val="both"/>
-      </w:pPr>
-      <w:r>
-        <w:rPr>
-          <w:i w:val="0"/>
-        </w:rPr>
-        <w:t>a) Gói giải pháp ba thành phần</w:t>
-      </w:r>
-    </w:p>
-    <w:p>
-      <w:pPr>
-        <w:jc w:val="center"/>
-      </w:pPr>
-      <w:r>
-        <w:rPr>
-          <w:b/>
-          <w:i/>
-        </w:rPr>
-        <w:t>Bảng 7. Giải pháp của Coolmate</w:t>
-      </w:r>
-    </w:p>
-    <w:tbl>
-      <w:tblPr>
-        <w:tblStyle w:val="TableGrid"/>
-        <w:tblW w:type="auto" w:w="0"/>
-        <w:tblLook w:firstColumn="1" w:firstRow="1" w:lastColumn="0" w:lastRow="0" w:noHBand="0" w:noVBand="1" w:val="04A0"/>
-      </w:tblPr>
-      <w:tblGrid>
-        <w:gridCol w:w="2880"/>
-        <w:gridCol w:w="2880"/>
-        <w:gridCol w:w="2880"/>
-      </w:tblGrid>
-      <w:tr>
-        <w:tc>
-          <w:tcPr>
-            <w:tcW w:type="dxa" w:w="2880"/>
-            <w:shd w:val="clear" w:fill="1F3A60"/>
-          </w:tcPr>
-          <w:p>
-            <w:r>
-              <w:rPr>
-                <w:b/>
-                <w:color w:val="FFFFFF"/>
-                <w:sz w:val="23"/>
-              </w:rPr>
-              <w:t>Thành phần</w:t>
-            </w:r>
-          </w:p>
-        </w:tc>
-        <w:tc>
-          <w:tcPr>
-            <w:tcW w:type="dxa" w:w="2880"/>
-            <w:shd w:val="clear" w:fill="1F3A60"/>
-          </w:tcPr>
-          <w:p>
-            <w:r>
-              <w:rPr>
-                <w:b/>
-                <w:color w:val="FFFFFF"/>
-                <w:sz w:val="23"/>
-              </w:rPr>
-              <w:t>Nội dung</w:t>
-            </w:r>
-          </w:p>
-        </w:tc>
-        <w:tc>
-          <w:tcPr>
-            <w:tcW w:type="dxa" w:w="2880"/>
-            <w:shd w:val="clear" w:fill="1F3A60"/>
-          </w:tcPr>
-          <w:p>
-            <w:r>
-              <w:rPr>
-                <w:b/>
-                <w:color w:val="FFFFFF"/>
-                <w:sz w:val="23"/>
-              </w:rPr>
-              <w:t>Điểm đau được giải quyết</w:t>
-            </w:r>
-          </w:p>
-        </w:tc>
-      </w:tr>
-      <w:tr>
-        <w:tc>
-          <w:tcPr>
-            <w:tcW w:type="dxa" w:w="2880"/>
-          </w:tcPr>
-          <w:p>
-            <w:r>
-              <w:rPr>
-                <w:sz w:val="23"/>
-              </w:rPr>
-              <w:t>Sản phẩm</w:t>
-            </w:r>
-          </w:p>
-        </w:tc>
-        <w:tc>
-          <w:tcPr>
-            <w:tcW w:type="dxa" w:w="2880"/>
-          </w:tcPr>
-          <w:p>
-            <w:r>
-              <w:rPr>
-                <w:sz w:val="23"/>
-              </w:rPr>
-              <w:t>Đồ cơ bản ít phụ thuộc trào lưu; chất liệu Excool thấm hút, nhanh khô, co giãn</w:t>
-            </w:r>
-          </w:p>
-        </w:tc>
-        <w:tc>
-          <w:tcPr>
-            <w:tcW w:type="dxa" w:w="2880"/>
-          </w:tcPr>
-          <w:p>
-            <w:r>
-              <w:rPr>
-                <w:sz w:val="23"/>
-              </w:rPr>
-              <w:t>Chất lượng không đồng đều</w:t>
-            </w:r>
-          </w:p>
-        </w:tc>
-      </w:tr>
-      <w:tr>
-        <w:tc>
-          <w:tcPr>
-            <w:tcW w:type="dxa" w:w="2880"/>
-          </w:tcPr>
-          <w:p>
-            <w:r>
-              <w:rPr>
-                <w:sz w:val="23"/>
-              </w:rPr>
-              <w:t>Kênh bán</w:t>
-            </w:r>
-          </w:p>
-        </w:tc>
-        <w:tc>
-          <w:tcPr>
-            <w:tcW w:type="dxa" w:w="2880"/>
-          </w:tcPr>
-          <w:p>
-            <w:r>
-              <w:rPr>
-                <w:sz w:val="23"/>
-              </w:rPr>
-              <w:t>Bán trực tiếp qua trang mạng riêng, sau mở rộng ra sàn và cửa hàng</w:t>
-            </w:r>
-          </w:p>
-        </w:tc>
-        <w:tc>
-          <w:tcPr>
-            <w:tcW w:type="dxa" w:w="2880"/>
-          </w:tcPr>
-          <w:p>
-            <w:r>
-              <w:rPr>
-                <w:sz w:val="23"/>
-              </w:rPr>
-              <w:t>Tốn thời gian đi mua</w:t>
-            </w:r>
-          </w:p>
-        </w:tc>
-      </w:tr>
-      <w:tr>
-        <w:tc>
-          <w:tcPr>
-            <w:tcW w:type="dxa" w:w="2880"/>
-          </w:tcPr>
-          <w:p>
-            <w:r>
-              <w:rPr>
-                <w:sz w:val="23"/>
-              </w:rPr>
-              <w:t>Hậu mãi</w:t>
-            </w:r>
-          </w:p>
-        </w:tc>
-        <w:tc>
-          <w:tcPr>
-            <w:tcW w:type="dxa" w:w="2880"/>
-          </w:tcPr>
-          <w:p>
-            <w:r>
-              <w:rPr>
-                <w:sz w:val="23"/>
-              </w:rPr>
-              <w:t>Đổi trả 60 ngày với sản phẩm đủ điều kiện, kể cả một số sản phẩm đã sử dụng</w:t>
-            </w:r>
-          </w:p>
-        </w:tc>
-        <w:tc>
-          <w:tcPr>
-            <w:tcW w:type="dxa" w:w="2880"/>
-          </w:tcPr>
-          <w:p>
-            <w:r>
-              <w:rPr>
-                <w:sz w:val="23"/>
-              </w:rPr>
-              <w:t>Sợ mua sai</w:t>
-            </w:r>
-          </w:p>
-        </w:tc>
-      </w:tr>
-      <w:tr>
-        <w:tc>
-          <w:tcPr>
-            <w:tcW w:type="dxa" w:w="2880"/>
-          </w:tcPr>
-          <w:p>
-            <w:r>
-              <w:rPr>
-                <w:sz w:val="23"/>
-              </w:rPr>
-              <w:t>Giá</w:t>
-            </w:r>
-          </w:p>
-        </w:tc>
-        <w:tc>
-          <w:tcPr>
-            <w:tcW w:type="dxa" w:w="2880"/>
-          </w:tcPr>
-          <w:p>
-            <w:r>
-              <w:rPr>
-                <w:sz w:val="23"/>
-              </w:rPr>
-              <w:t>Phổ thông: quần lót khoảng 129.000 đồng, áo thun thể thao khoảng 199.000 đồng</w:t>
-            </w:r>
-          </w:p>
-        </w:tc>
-        <w:tc>
-          <w:tcPr>
-            <w:tcW w:type="dxa" w:w="2880"/>
-          </w:tcPr>
-          <w:p>
-            <w:r>
-              <w:rPr>
-                <w:sz w:val="23"/>
-              </w:rPr>
-              <w:t>Hàng tốt thì đắt</w:t>
-            </w:r>
-          </w:p>
-        </w:tc>
-      </w:tr>
-    </w:tbl>
-    <w:p/>
-    <w:p>
-      <w:r>
-        <w:rPr>
-          <w:i/>
-          <w:color w:val="555555"/>
-          <w:sz w:val="21"/>
-        </w:rPr>
-        <w:t>Nguồn: Coolmate. (2023a, ngày 19 tháng 6). Khám phá dòng sản phẩm mang công nghệ vải Excool. https://www.coolmate.me/blog/dong-san-pham-cong-nghe-excool-tai-coolmate-2044</w:t>
-      </w:r>
-    </w:p>
-    <w:p>
-      <w:r>
-        <w:rPr>
-          <w:i/>
-          <w:color w:val="555555"/>
-          <w:sz w:val="21"/>
-        </w:rPr>
-        <w:t>Nguồn: Coolmate. (không ghi ngày-d). Dịch vụ 60 ngày đổi trả. Truy cập ngày 10 tháng 10 năm 2026, tại https://www.coolmate.me/page/dich-vu-60-ngay-doi-tra</w:t>
-      </w:r>
-    </w:p>
-    <w:p>
-      <w:r>
-        <w:rPr>
-          <w:i/>
-          <w:color w:val="555555"/>
-          <w:sz w:val="21"/>
-        </w:rPr>
-        <w:t>Nguồn: Coolmate. (không ghi ngày-e). Quần lót nam chạy bộ Fast &amp; Free (trang sản phẩm). Truy cập ngày 10 tháng 10 năm 2026, tại https://www.coolmate.me/product/quan-lot-nam-chay-bo-fast-free-run?color=den</w:t>
-      </w:r>
-    </w:p>
-    <w:p>
-      <w:r>
-        <w:rPr>
-          <w:i/>
-          <w:color w:val="555555"/>
-          <w:sz w:val="21"/>
-        </w:rPr>
-        <w:t>Nguồn: Coolmate. (không ghi ngày-f). Áo thun nam thể thao Active (trang sản phẩm). Truy cập ngày 10 tháng 10 năm 2026, tại https://www.coolmate.me/product/ao-thun-the-thao-active-phoi-mau-thoang-khi2?color=den</w:t>
-      </w:r>
-    </w:p>
-    <w:p>
-      <w:pPr>
-        <w:jc w:val="both"/>
-      </w:pPr>
-      <w:r>
-        <w:rPr>
-          <w:i w:val="0"/>
-        </w:rPr>
-        <w:t>b) Mô hình bán trực tiếp – nguồn gốc của giá hợp lý</w:t>
-      </w:r>
-    </w:p>
-    <w:p>
-      <w:pPr>
-        <w:jc w:val="both"/>
-      </w:pPr>
-      <w:r>
-        <w:rPr>
-          <w:i w:val="0"/>
-        </w:rPr>
-        <w:t>Bằng cách bán thẳng tới người tiêu dùng qua kênh trực tuyến, Coolmate cắt giảm chi phí trung gian và chi phí cửa hàng của bán lẻ truyền thống (Đại biểu Nhân dân, 2022), từ đó dồn chi phí vào chất lượng sản phẩm và trải nghiệm mua hàng thay vì quảng cáo rầm rộ (Brands Vietnam, 2023).</w:t>
-      </w:r>
-    </w:p>
-    <w:p>
-      <w:r>
-        <w:rPr>
-          <w:i/>
-          <w:color w:val="555555"/>
-          <w:sz w:val="21"/>
-        </w:rPr>
-        <w:t>Nguồn: Đại biểu Nhân dân. (2022). Coolmate – Hành trình từ con số 0 đến doanh thu trăm tỷ. https://daibieunhandan.vn/coolmate-hanh-trinh-tu-con-so-0-den-doanh-thu-tram-ty-10308212.html</w:t>
-      </w:r>
-    </w:p>
-    <w:p>
-      <w:r>
-        <w:rPr>
-          <w:i/>
-          <w:color w:val="555555"/>
-          <w:sz w:val="21"/>
-        </w:rPr>
-        <w:t>Nguồn: Brands Vietnam. (2023). Case study startup thành công – Cách Coolmate tăng trưởng 4 lần/năm. https://www.brandsvietnam.com/congdong/topic/332810-case-study-startup-thanh-cong-cach-coolmate-tang-truong-4-lan-nam</w:t>
-      </w:r>
-    </w:p>
-    <w:p>
-      <w:pPr>
-        <w:jc w:val="both"/>
-      </w:pPr>
-      <w:r>
-        <w:rPr>
-          <w:i w:val="0"/>
-        </w:rPr>
-        <w:t>c) Chính sách đổi trả – xóa nỗi sợ mua sai</w:t>
-      </w:r>
-    </w:p>
-    <w:p>
-      <w:pPr>
-        <w:jc w:val="both"/>
-      </w:pPr>
-      <w:r>
-        <w:rPr>
-          <w:i w:val="0"/>
-        </w:rPr>
-        <w:t>Chính sách đổi trả 60 ngày là “vũ khí” giúp khách mạnh dạn mua lần đầu. Tuy nhiên, chính sách có ngoại lệ với hàng thanh lý, hàng theo yêu cầu và một số nhóm khuyến mại (Coolmate, không ghi ngày-d), nên không phải mọi sản phẩm đều được đổi trả vô điều kiện.</w:t>
-      </w:r>
-    </w:p>
-    <w:p>
-      <w:r>
-        <w:rPr>
-          <w:i/>
-          <w:color w:val="555555"/>
-          <w:sz w:val="21"/>
-        </w:rPr>
-        <w:t>Nguồn: Coolmate. (không ghi ngày-d). Dịch vụ 60 ngày đổi trả. Truy cập ngày 10 tháng 10 năm 2026, tại https://www.coolmate.me/page/dich-vu-60-ngay-doi-tra</w:t>
-      </w:r>
-    </w:p>
-    <w:p>
-      <w:pPr>
-        <w:jc w:val="both"/>
-      </w:pPr>
-      <w:r>
-        <w:rPr>
-          <w:i w:val="0"/>
-        </w:rPr>
-        <w:t>d) Từ một kênh sang nhiều kênh</w:t>
-      </w:r>
-    </w:p>
-    <w:p>
-      <w:pPr>
-        <w:jc w:val="both"/>
-      </w:pPr>
-      <w:r>
-        <w:rPr>
-          <w:i w:val="0"/>
-        </w:rPr>
-        <w:t>Từ tháng 3/2026, cửa hàng tại Hà Nội cho khách trực tiếp thử chất vải và kích cỡ. Hệ thống công nghệ do doanh nghiệp tự xây dựng đồng bộ dữ liệu đơn hàng, tồn kho và khách hàng trên các kênh (Ng, 2026). Đến tháng 11/2025, Coolmate đã giao hơn 5 triệu đơn hàng trong hơn sáu năm (Coolmate, 2025).</w:t>
-      </w:r>
-    </w:p>
-    <w:p>
-      <w:r>
-        <w:rPr>
-          <w:i/>
-          <w:color w:val="555555"/>
-          <w:sz w:val="21"/>
-        </w:rPr>
-        <w:t>Nguồn: Ng, V. (2026, ngày 15 tháng 5). How a Vietnamese D2C retailer built its own secure digital infrastructure. DigiconAsia. https://digiconasia.net/features/how-a-vietnamese-d2c-retailer-built-its-own-secure-digital-infrastructure</w:t>
-      </w:r>
-    </w:p>
-    <w:p>
-      <w:r>
-        <w:rPr>
-          <w:i/>
-          <w:color w:val="555555"/>
-          <w:sz w:val="21"/>
-        </w:rPr>
-        <w:t>Nguồn: Coolmate. (2025, ngày 3 tháng 11). Coolmate gọi vốn thành công vòng đầu tư tăng trưởng, mở ra chương mới cho thương hiệu Việt. https://www.coolmate.me/blog/coolmate-goi-von-thanh-cong-series-c-mo-ra-chuong-moi-cho-thuong-hieu-viet</w:t>
-      </w:r>
-    </w:p>
-    <w:p>
-      <w:pPr>
-        <w:jc w:val="both"/>
-      </w:pPr>
-      <w:r>
-        <w:rPr>
-          <w:i w:val="0"/>
-        </w:rPr>
-        <w:t>e) Tính bền vững của lợi thế</w:t>
-      </w:r>
-    </w:p>
-    <w:p>
-      <w:pPr>
-        <w:jc w:val="both"/>
-      </w:pPr>
-      <w:r>
-        <w:rPr>
-          <w:i w:val="0"/>
-        </w:rPr>
-        <w:t>Đối thủ có thể sao chép sản phẩm đơn giản hoặc chính sách đổi trả. Rào cản bền vững hơn nằm ở năng lực phối hợp thiết kế, dữ liệu bán hàng, chất lượng nhà cung cấp và niềm tin tích lũy qua hàng triệu đơn hàng. Thông tin về chất liệu do doanh nghiệp tự công bố, cần đối chiếu với kiểm nghiệm độc lập.</w:t>
-      </w:r>
-    </w:p>
-    <w:p>
-      <w:pPr>
-        <w:jc w:val="both"/>
-      </w:pPr>
-      <w:r>
-        <w:rPr>
-          <w:b/>
-        </w:rPr>
-        <w:t xml:space="preserve">Đánh giá: </w:t>
-      </w:r>
-      <w:r>
-        <w:rPr>
-          <w:i w:val="0"/>
-        </w:rPr>
-        <w:t>Giải pháp khớp trực tiếp với từng điểm đau năm 2019 và đã được thị trường chấp nhận. Chấm 4/5 vì sản phẩm và chính sách dễ bị sao chép, đồng thời chưa có dữ liệu về lợi nhuận ròng trên mỗi đơn hàng.</w:t>
-      </w:r>
-    </w:p>
-    <w:p>
-      <w:pPr>
-        <w:pStyle w:val="Heading2"/>
-      </w:pPr>
-      <w:r>
-        <w:rPr>
-          <w:rFonts w:ascii="Times New Roman" w:hAnsi="Times New Roman"/>
-          <w:color w:val="1F3A60"/>
-        </w:rPr>
-        <w:t>3. Đội ngũ sáng lập – 4/5</w:t>
-      </w:r>
-    </w:p>
-    <w:p>
-      <w:pPr>
-        <w:jc w:val="both"/>
-      </w:pPr>
-      <w:r>
-        <w:rPr>
-          <w:b/>
-        </w:rPr>
-        <w:t xml:space="preserve">Câu hỏi đặt ra: </w:t>
-      </w:r>
-      <w:r>
-        <w:rPr>
-          <w:i/>
-        </w:rPr>
-        <w:t>Nhóm sáng lập là ai, có học vấn và kinh nghiệm gì, có bổ trợ nhau và đủ năng lực biến ý tưởng thành kinh doanh thực tế không?</w:t>
-      </w:r>
-    </w:p>
-    <w:p>
-      <w:pPr>
-        <w:jc w:val="both"/>
-      </w:pPr>
-      <w:r>
-        <w:rPr>
-          <w:i w:val="0"/>
-        </w:rPr>
-        <w:t>a) Chân dung từng nhà sáng lập</w:t>
-      </w:r>
-    </w:p>
-    <w:p>
-      <w:pPr>
-        <w:jc w:val="center"/>
-      </w:pPr>
-      <w:r>
-        <w:rPr>
-          <w:b/>
-          <w:i/>
-        </w:rPr>
-        <w:t>Bảng 8. Hồ sơ đội ngũ sáng lập Coolmate</w:t>
-      </w:r>
-    </w:p>
-    <w:tbl>
-      <w:tblPr>
-        <w:tblStyle w:val="TableGrid"/>
-        <w:tblW w:type="auto" w:w="0"/>
-        <w:tblLook w:firstColumn="1" w:firstRow="1" w:lastColumn="0" w:lastRow="0" w:noHBand="0" w:noVBand="1" w:val="04A0"/>
-      </w:tblPr>
-      <w:tblGrid>
-        <w:gridCol w:w="2160"/>
-        <w:gridCol w:w="2160"/>
-        <w:gridCol w:w="2160"/>
-        <w:gridCol w:w="2160"/>
-      </w:tblGrid>
-      <w:tr>
-        <w:tc>
-          <w:tcPr>
-            <w:tcW w:type="dxa" w:w="2160"/>
-            <w:shd w:val="clear" w:fill="1F3A60"/>
-          </w:tcPr>
-          <w:p>
-            <w:r>
-              <w:rPr>
-                <w:b/>
-                <w:color w:val="FFFFFF"/>
-                <w:sz w:val="23"/>
-              </w:rPr>
-              <w:t>Nhà sáng lập</w:t>
-            </w:r>
-          </w:p>
-        </w:tc>
-        <w:tc>
-          <w:tcPr>
-            <w:tcW w:type="dxa" w:w="2160"/>
-            <w:shd w:val="clear" w:fill="1F3A60"/>
-          </w:tcPr>
-          <w:p>
-            <w:r>
-              <w:rPr>
-                <w:b/>
-                <w:color w:val="FFFFFF"/>
-                <w:sz w:val="23"/>
-              </w:rPr>
-              <w:t>Vai trò tại Coolmate</w:t>
-            </w:r>
-          </w:p>
-        </w:tc>
-        <w:tc>
-          <w:tcPr>
-            <w:tcW w:type="dxa" w:w="2160"/>
-            <w:shd w:val="clear" w:fill="1F3A60"/>
-          </w:tcPr>
-          <w:p>
-            <w:r>
-              <w:rPr>
-                <w:b/>
-                <w:color w:val="FFFFFF"/>
-                <w:sz w:val="23"/>
-              </w:rPr>
-              <w:t>Học vấn</w:t>
-            </w:r>
-          </w:p>
-        </w:tc>
-        <w:tc>
-          <w:tcPr>
-            <w:tcW w:type="dxa" w:w="2160"/>
-            <w:shd w:val="clear" w:fill="1F3A60"/>
-          </w:tcPr>
-          <w:p>
-            <w:r>
-              <w:rPr>
-                <w:b/>
-                <w:color w:val="FFFFFF"/>
-                <w:sz w:val="23"/>
-              </w:rPr>
-              <w:t>Kinh nghiệm trước Coolmate</w:t>
-            </w:r>
-          </w:p>
-        </w:tc>
-      </w:tr>
-      <w:tr>
-        <w:tc>
-          <w:tcPr>
-            <w:tcW w:type="dxa" w:w="2160"/>
-          </w:tcPr>
-          <w:p>
-            <w:r>
-              <w:rPr>
-                <w:sz w:val="23"/>
-              </w:rPr>
-              <w:t>Phạm Chí Nhu</w:t>
-            </w:r>
-          </w:p>
-        </w:tc>
-        <w:tc>
-          <w:tcPr>
-            <w:tcW w:type="dxa" w:w="2160"/>
-          </w:tcPr>
-          <w:p>
-            <w:r>
-              <w:rPr>
-                <w:sz w:val="23"/>
-              </w:rPr>
-              <w:t>Đồng sáng lập, Tổng Giám đốc (từ 2019)</w:t>
-            </w:r>
-          </w:p>
-        </w:tc>
-        <w:tc>
-          <w:tcPr>
-            <w:tcW w:type="dxa" w:w="2160"/>
-          </w:tcPr>
-          <w:p>
-            <w:r>
-              <w:rPr>
-                <w:sz w:val="23"/>
-              </w:rPr>
-              <w:t>Đại học Ngoại thương</w:t>
-            </w:r>
-          </w:p>
-        </w:tc>
-        <w:tc>
-          <w:tcPr>
-            <w:tcW w:type="dxa" w:w="2160"/>
-          </w:tcPr>
-          <w:p>
-            <w:r>
-              <w:rPr>
-                <w:sz w:val="23"/>
-              </w:rPr>
-              <w:t>Làm trong ngành kiểm toán; quản lý trang thương mại điện tử của một thương hiệu thời trang; từng làm việc tại Deloitte và adidas (theo hồ sơ CB Insights); tự bán quần áo trên Shopee</w:t>
-            </w:r>
-          </w:p>
-        </w:tc>
-      </w:tr>
-      <w:tr>
-        <w:tc>
-          <w:tcPr>
-            <w:tcW w:type="dxa" w:w="2160"/>
-          </w:tcPr>
-          <w:p>
-            <w:r>
-              <w:rPr>
-                <w:sz w:val="23"/>
-              </w:rPr>
-              <w:t>Nguyễn Hoài Xuân Lan</w:t>
-            </w:r>
-          </w:p>
-        </w:tc>
-        <w:tc>
-          <w:tcPr>
-            <w:tcW w:type="dxa" w:w="2160"/>
-          </w:tcPr>
-          <w:p>
-            <w:r>
-              <w:rPr>
-                <w:sz w:val="23"/>
-              </w:rPr>
-              <w:t>Đồng sáng lập, Giám đốc tiếp thị</w:t>
-            </w:r>
-          </w:p>
-        </w:tc>
-        <w:tc>
-          <w:tcPr>
-            <w:tcW w:type="dxa" w:w="2160"/>
-          </w:tcPr>
-          <w:p>
-            <w:r>
-              <w:rPr>
-                <w:sz w:val="23"/>
-              </w:rPr>
-              <w:t>Chưa có thông tin công khai</w:t>
-            </w:r>
-          </w:p>
-        </w:tc>
-        <w:tc>
-          <w:tcPr>
-            <w:tcW w:type="dxa" w:w="2160"/>
-          </w:tcPr>
-          <w:p>
-            <w:r>
-              <w:rPr>
-                <w:sz w:val="23"/>
-              </w:rPr>
-              <w:t>Từng làm Giám đốc điều hành một công ty dịch vụ tiếp thị trong 2 năm; kinh nghiệm tiếp thị trực tuyến</w:t>
-            </w:r>
-          </w:p>
-        </w:tc>
-      </w:tr>
-      <w:tr>
-        <w:tc>
-          <w:tcPr>
-            <w:tcW w:type="dxa" w:w="2160"/>
-          </w:tcPr>
-          <w:p>
-            <w:r>
-              <w:rPr>
-                <w:sz w:val="23"/>
-              </w:rPr>
-              <w:t>Nguyễn Văn Hiệp</w:t>
-            </w:r>
-          </w:p>
-        </w:tc>
-        <w:tc>
-          <w:tcPr>
-            <w:tcW w:type="dxa" w:w="2160"/>
-          </w:tcPr>
-          <w:p>
-            <w:r>
-              <w:rPr>
-                <w:sz w:val="23"/>
-              </w:rPr>
-              <w:t>Đồng sáng lập, Giám đốc công nghệ</w:t>
-            </w:r>
-          </w:p>
-        </w:tc>
-        <w:tc>
-          <w:tcPr>
-            <w:tcW w:type="dxa" w:w="2160"/>
-          </w:tcPr>
-          <w:p>
-            <w:r>
-              <w:rPr>
-                <w:sz w:val="23"/>
-              </w:rPr>
-              <w:t>Chưa có thông tin công khai</w:t>
-            </w:r>
-          </w:p>
-        </w:tc>
-        <w:tc>
-          <w:tcPr>
-            <w:tcW w:type="dxa" w:w="2160"/>
-          </w:tcPr>
-          <w:p>
-            <w:r>
-              <w:rPr>
-                <w:sz w:val="23"/>
-              </w:rPr>
-              <w:t>Từng là trưởng nhóm kỹ thuật (có nguồn ghi là Giám đốc công nghệ) tại Ecomobi; kinh nghiệm lập trình, xây dựng hệ thống</w:t>
-            </w:r>
-          </w:p>
-        </w:tc>
-      </w:tr>
-    </w:tbl>
-    <w:p/>
-    <w:p>
-      <w:r>
-        <w:rPr>
-          <w:i/>
-          <w:color w:val="555555"/>
-          <w:sz w:val="21"/>
-        </w:rPr>
-        <w:t>Nguồn: Crunchbase. (không ghi ngày). Nhu Pham – CEO &amp; Founder @ COOLMATE. Truy cập ngày 10 tháng 10 năm 2026, tại https://www.crunchbase.com/person/nhu-pham-b90c</w:t>
-      </w:r>
-    </w:p>
-    <w:p>
-      <w:r>
-        <w:rPr>
-          <w:i/>
-          <w:color w:val="555555"/>
-          <w:sz w:val="21"/>
-        </w:rPr>
-        <w:t>Nguồn: CB Insights. (không ghi ngày). CoolMate – CEO, founder, key executive team. Truy cập ngày 10 tháng 10 năm 2026, tại https://www.cbinsights.com/company/coolmate/people</w:t>
-      </w:r>
-    </w:p>
-    <w:p>
-      <w:r>
-        <w:rPr>
-          <w:i/>
-          <w:color w:val="555555"/>
-          <w:sz w:val="21"/>
-        </w:rPr>
-        <w:t>Nguồn: Vietcetera. (2020). A brand’s story: Coolmate – A smart solution for the male wardrobe. https://vietcetera.com/en/a-brands-story-coolmate--a-smart-solution-for-the-male-wardrobe</w:t>
-      </w:r>
-    </w:p>
-    <w:p>
-      <w:r>
-        <w:rPr>
-          <w:i/>
-          <w:color w:val="555555"/>
-          <w:sz w:val="21"/>
-        </w:rPr>
-        <w:t>Nguồn: Vertex Ventures. (2024). Coolmate wants to be Vietnam’s next unicorn. https://www.vertexventures.sg/news/coolmate-wants-to-be-vietnams-next-unicorn/</w:t>
-      </w:r>
-    </w:p>
-    <w:p>
-      <w:r>
-        <w:rPr>
-          <w:i/>
-          <w:color w:val="555555"/>
-          <w:sz w:val="21"/>
-        </w:rPr>
-        <w:t>Nguồn: The Org. (không ghi ngày). Xuan Lan Nguyen Hoai – Co-Founder and Marketing Director at Coolmate. Truy cập ngày 10 tháng 10 năm 2026, tại https://theorg.com/org/coolmate/org-chart/xuan-lan-nguyen-hoai</w:t>
-      </w:r>
-    </w:p>
-    <w:p>
-      <w:r>
-        <w:rPr>
-          <w:i/>
-          <w:color w:val="555555"/>
-          <w:sz w:val="21"/>
-        </w:rPr>
-        <w:t>Nguồn: CafeBiz. (2021, 4 tháng 5). Chân dung startup Coolmate vừa gọi vốn thành công 500.000 USD trên Shark Tank. https://cafebiz.vn/chan-dung-startup-coolmate-vua-goi-von-thanh-cong-500000-usd-tren-shark-tank-tung-di-thi-khoi-nghiep-chi-lot-top-10-nay-da-la-ong-trum-ban-chuc-nghin-don-tren-shopee-20210504091320202.chn</w:t>
-      </w:r>
-    </w:p>
-    <w:p>
-      <w:r>
-        <w:rPr>
-          <w:i/>
-          <w:color w:val="555555"/>
-          <w:sz w:val="21"/>
-        </w:rPr>
-        <w:t>Nguồn: Forbes Việt Nam. (2022). Startup thời trang không có cửa hàng, không có nhà máy, chỉ bán online. https://forbes.vn/startup-thoi-trang-noi-khong-voi-mo-cua-hang/</w:t>
-      </w:r>
-    </w:p>
-    <w:p>
-      <w:pPr>
-        <w:jc w:val="both"/>
-      </w:pPr>
-      <w:r>
-        <w:rPr>
-          <w:i w:val="0"/>
-        </w:rPr>
-        <w:t>Ông Phạm Chí Nhu: kinh nghiệm kiểm toán giúp ông có tư duy tài chính, còn thời gian quản lý trang thương mại điện tử thời trang và tự bán hàng trên Shopee giúp ông hiểu cả chuỗi giá trị lẫn hạn chế của mô hình bán qua sàn – từ đó hình thành ý tưởng bán trực tiếp (Vietcetera, 2020; Vertex Ventures, 2024). Ông theo học Đại học Ngoại thương (Crunchbase, không ghi ngày); hồ sơ CB Insights liệt kê Deloitte và adidas trong quá trình làm việc trước đây (CB Insights, không ghi ngày).</w:t>
-      </w:r>
-    </w:p>
-    <w:p>
-      <w:r>
-        <w:rPr>
-          <w:i/>
-          <w:color w:val="555555"/>
-          <w:sz w:val="21"/>
-        </w:rPr>
-        <w:t>Nguồn: Vietcetera. (2020). A brand’s story: Coolmate – A smart solution for the male wardrobe. https://vietcetera.com/en/a-brands-story-coolmate--a-smart-solution-for-the-male-wardrobe</w:t>
-      </w:r>
-    </w:p>
-    <w:p>
-      <w:r>
-        <w:rPr>
-          <w:i/>
-          <w:color w:val="555555"/>
-          <w:sz w:val="21"/>
-        </w:rPr>
-        <w:t>Nguồn: Vertex Ventures. (2024). Coolmate wants to be Vietnam’s next unicorn. https://www.vertexventures.sg/news/coolmate-wants-to-be-vietnams-next-unicorn/</w:t>
-      </w:r>
-    </w:p>
-    <w:p>
-      <w:r>
-        <w:rPr>
-          <w:i/>
-          <w:color w:val="555555"/>
-          <w:sz w:val="21"/>
-        </w:rPr>
-        <w:t>Nguồn: Crunchbase. (không ghi ngày). Nhu Pham – CEO &amp; Founder @ COOLMATE. Truy cập ngày 10 tháng 10 năm 2026, tại https://www.crunchbase.com/person/nhu-pham-b90c</w:t>
-      </w:r>
-    </w:p>
-    <w:p>
-      <w:r>
-        <w:rPr>
-          <w:i/>
-          <w:color w:val="555555"/>
-          <w:sz w:val="21"/>
-        </w:rPr>
-        <w:t>Nguồn: CB Insights. (không ghi ngày). CoolMate – CEO, founder, key executive team. Truy cập ngày 10 tháng 10 năm 2026, tại https://www.cbinsights.com/company/coolmate/people</w:t>
-      </w:r>
-    </w:p>
-    <w:p>
-      <w:pPr>
-        <w:jc w:val="both"/>
-      </w:pPr>
-      <w:r>
-        <w:rPr>
-          <w:i w:val="0"/>
-        </w:rPr>
-        <w:t>Bà Nguyễn Hoài Xuân Lan: từng làm Giám đốc điều hành một công ty dịch vụ tiếp thị trong khoảng 2 năm, có kinh nghiệm tiếp thị trực tuyến (CafeBiz, 2021). Đây là năng lực quan trọng với một thương hiệu chỉ bán qua mạng ở giai đoạn đầu.</w:t>
-      </w:r>
-    </w:p>
-    <w:p>
-      <w:r>
-        <w:rPr>
-          <w:i/>
-          <w:color w:val="555555"/>
-          <w:sz w:val="21"/>
-        </w:rPr>
-        <w:t>Nguồn: CafeBiz. (2021, 4 tháng 5). Chân dung startup Coolmate vừa gọi vốn thành công 500.000 USD trên Shark Tank. https://cafebiz.vn/chan-dung-startup-coolmate-vua-goi-von-thanh-cong-500000-usd-tren-shark-tank-tung-di-thi-khoi-nghiep-chi-lot-top-10-nay-da-la-ong-trum-ban-chuc-nghin-don-tren-shopee-20210504091320202.chn</w:t>
-      </w:r>
-    </w:p>
-    <w:p>
-      <w:r>
-        <w:rPr>
-          <w:i/>
-          <w:color w:val="555555"/>
-          <w:sz w:val="21"/>
-        </w:rPr>
-        <w:t>Nguồn: The Org. (không ghi ngày). Xuan Lan Nguyen Hoai – Co-Founder and Marketing Director at Coolmate. Truy cập ngày 10 tháng 10 năm 2026, tại https://theorg.com/org/coolmate/org-chart/xuan-lan-nguyen-hoai</w:t>
-      </w:r>
-    </w:p>
-    <w:p>
-      <w:pPr>
-        <w:jc w:val="both"/>
-      </w:pPr>
-      <w:r>
-        <w:rPr>
-          <w:i w:val="0"/>
-        </w:rPr>
-        <w:t>Ông Nguyễn Văn Hiệp: từng là trưởng nhóm kỹ thuật tại Ecomobi (CafeBiz, 2021; Forbes Việt Nam, 2022). Ông chủ trương tự xây dựng hệ thống quản trị doanh nghiệp nội bộ thay vì dùng phần mềm bên thứ ba, vì cho rằng như vậy Coolmate mới kiểm soát được hệ thống (Forbes Việt Nam, 2022).</w:t>
-      </w:r>
-    </w:p>
-    <w:p>
-      <w:r>
-        <w:rPr>
-          <w:i/>
-          <w:color w:val="555555"/>
-          <w:sz w:val="21"/>
-        </w:rPr>
-        <w:t>Nguồn: CafeBiz. (2021, 4 tháng 5). Chân dung startup Coolmate vừa gọi vốn thành công 500.000 USD trên Shark Tank. https://cafebiz.vn/chan-dung-startup-coolmate-vua-goi-von-thanh-cong-500000-usd-tren-shark-tank-tung-di-thi-khoi-nghiep-chi-lot-top-10-nay-da-la-ong-trum-ban-chuc-nghin-don-tren-shopee-20210504091320202.chn</w:t>
-      </w:r>
-    </w:p>
-    <w:p>
-      <w:r>
-        <w:rPr>
-          <w:i/>
-          <w:color w:val="555555"/>
-          <w:sz w:val="21"/>
-        </w:rPr>
-        <w:t>Nguồn: Forbes Việt Nam. (2022). Startup thời trang không có cửa hàng, không có nhà máy, chỉ bán online. https://forbes.vn/startup-thoi-trang-noi-khong-voi-mo-cua-hang/</w:t>
-      </w:r>
-    </w:p>
-    <w:p>
-      <w:pPr>
-        <w:jc w:val="both"/>
-      </w:pPr>
-      <w:r>
-        <w:rPr>
-          <w:i w:val="0"/>
-        </w:rPr>
-        <w:t>b) Sự bổ trợ của đội ngũ</w:t>
-      </w:r>
-    </w:p>
-    <w:p>
-      <w:pPr>
-        <w:jc w:val="center"/>
-      </w:pPr>
-      <w:r>
-        <w:rPr>
-          <w:b/>
-          <w:i/>
-        </w:rPr>
-        <w:t>Bảng 9. Mức độ bổ trợ của nhóm sáng lập</w:t>
-      </w:r>
-    </w:p>
-    <w:tbl>
-      <w:tblPr>
-        <w:tblStyle w:val="TableGrid"/>
-        <w:tblW w:type="auto" w:w="0"/>
-        <w:tblLook w:firstColumn="1" w:firstRow="1" w:lastColumn="0" w:lastRow="0" w:noHBand="0" w:noVBand="1" w:val="04A0"/>
-      </w:tblPr>
-      <w:tblGrid>
-        <w:gridCol w:w="2880"/>
-        <w:gridCol w:w="2880"/>
-        <w:gridCol w:w="2880"/>
-      </w:tblGrid>
-      <w:tr>
-        <w:tc>
-          <w:tcPr>
-            <w:tcW w:type="dxa" w:w="2880"/>
-            <w:shd w:val="clear" w:fill="1F3A60"/>
-          </w:tcPr>
-          <w:p>
-            <w:r>
-              <w:rPr>
-                <w:b/>
-                <w:color w:val="FFFFFF"/>
-                <w:sz w:val="23"/>
-              </w:rPr>
-              <w:t>Năng lực cần có của thương hiệu bán trực tiếp</w:t>
-            </w:r>
-          </w:p>
-        </w:tc>
-        <w:tc>
-          <w:tcPr>
-            <w:tcW w:type="dxa" w:w="2880"/>
-            <w:shd w:val="clear" w:fill="1F3A60"/>
-          </w:tcPr>
-          <w:p>
-            <w:r>
-              <w:rPr>
-                <w:b/>
-                <w:color w:val="FFFFFF"/>
-                <w:sz w:val="23"/>
-              </w:rPr>
-              <w:t>Người đảm nhận</w:t>
-            </w:r>
-          </w:p>
-        </w:tc>
-        <w:tc>
-          <w:tcPr>
-            <w:tcW w:type="dxa" w:w="2880"/>
-            <w:shd w:val="clear" w:fill="1F3A60"/>
-          </w:tcPr>
-          <w:p>
-            <w:r>
-              <w:rPr>
-                <w:b/>
-                <w:color w:val="FFFFFF"/>
-                <w:sz w:val="23"/>
-              </w:rPr>
-              <w:t>Bằng chứng</w:t>
-            </w:r>
-          </w:p>
-        </w:tc>
-      </w:tr>
-      <w:tr>
-        <w:tc>
-          <w:tcPr>
-            <w:tcW w:type="dxa" w:w="2880"/>
-          </w:tcPr>
-          <w:p>
-            <w:r>
-              <w:rPr>
-                <w:sz w:val="23"/>
-              </w:rPr>
-              <w:t>Sản phẩm, tài chính, chiến lược, gọi vốn</w:t>
-            </w:r>
-          </w:p>
-        </w:tc>
-        <w:tc>
-          <w:tcPr>
-            <w:tcW w:type="dxa" w:w="2880"/>
-          </w:tcPr>
-          <w:p>
-            <w:r>
-              <w:rPr>
-                <w:sz w:val="23"/>
-              </w:rPr>
-              <w:t>Phạm Chí Nhu</w:t>
-            </w:r>
-          </w:p>
-        </w:tc>
-        <w:tc>
-          <w:tcPr>
-            <w:tcW w:type="dxa" w:w="2880"/>
-          </w:tcPr>
-          <w:p>
-            <w:r>
-              <w:rPr>
-                <w:sz w:val="23"/>
-              </w:rPr>
-              <w:t>Kinh nghiệm kiểm toán, thương mại điện tử thời trang; dẫn dắt nhiều vòng gọi vốn</w:t>
-            </w:r>
-          </w:p>
-        </w:tc>
-      </w:tr>
-      <w:tr>
-        <w:tc>
-          <w:tcPr>
-            <w:tcW w:type="dxa" w:w="2880"/>
-          </w:tcPr>
-          <w:p>
-            <w:r>
-              <w:rPr>
-                <w:sz w:val="23"/>
-              </w:rPr>
-              <w:t>Thu hút khách hàng</w:t>
-            </w:r>
-          </w:p>
-        </w:tc>
-        <w:tc>
-          <w:tcPr>
-            <w:tcW w:type="dxa" w:w="2880"/>
-          </w:tcPr>
-          <w:p>
-            <w:r>
-              <w:rPr>
-                <w:sz w:val="23"/>
-              </w:rPr>
-              <w:t>Nguyễn Hoài Xuân Lan</w:t>
-            </w:r>
-          </w:p>
-        </w:tc>
-        <w:tc>
-          <w:tcPr>
-            <w:tcW w:type="dxa" w:w="2880"/>
-          </w:tcPr>
-          <w:p>
-            <w:r>
-              <w:rPr>
-                <w:sz w:val="23"/>
-              </w:rPr>
-              <w:t>Kinh nghiệm điều hành công ty tiếp thị</w:t>
-            </w:r>
-          </w:p>
-        </w:tc>
-      </w:tr>
-      <w:tr>
-        <w:tc>
-          <w:tcPr>
-            <w:tcW w:type="dxa" w:w="2880"/>
-          </w:tcPr>
-          <w:p>
-            <w:r>
-              <w:rPr>
-                <w:sz w:val="23"/>
-              </w:rPr>
-              <w:t>Nền tảng công nghệ, dữ liệu</w:t>
-            </w:r>
-          </w:p>
-        </w:tc>
-        <w:tc>
-          <w:tcPr>
-            <w:tcW w:type="dxa" w:w="2880"/>
-          </w:tcPr>
-          <w:p>
-            <w:r>
-              <w:rPr>
-                <w:sz w:val="23"/>
-              </w:rPr>
-              <w:t>Nguyễn Văn Hiệp</w:t>
-            </w:r>
-          </w:p>
-        </w:tc>
-        <w:tc>
-          <w:tcPr>
-            <w:tcW w:type="dxa" w:w="2880"/>
-          </w:tcPr>
-          <w:p>
-            <w:r>
-              <w:rPr>
-                <w:sz w:val="23"/>
-              </w:rPr>
-              <w:t>Kinh nghiệm kỹ thuật tại Ecomobi; xây hệ thống nội bộ</w:t>
-            </w:r>
-          </w:p>
-        </w:tc>
-      </w:tr>
-    </w:tbl>
-    <w:p/>
-    <w:p>
-      <w:pPr>
-        <w:jc w:val="both"/>
-      </w:pPr>
-      <w:r>
-        <w:rPr>
-          <w:i w:val="0"/>
-        </w:rPr>
-        <w:t>c) Bằng chứng về năng lực thực thi</w:t>
-      </w:r>
-    </w:p>
-    <w:p>
-      <w:pPr>
-        <w:jc w:val="both"/>
-      </w:pPr>
-      <w:r>
-        <w:rPr>
-          <w:i w:val="0"/>
-        </w:rPr>
-        <w:t>Khởi đầu từ một nhà kho khoảng 20 mét vuông năm 2019, đội ngũ đã:</w:t>
-      </w:r>
-    </w:p>
-    <w:p>
-      <w:pPr>
-        <w:pStyle w:val="ListBullet"/>
-        <w:jc w:val="both"/>
-      </w:pPr>
-      <w:r>
-        <w:t>Gọi vốn thành công 500.000 đô la Mỹ trên chương trình Shark Tank Việt Nam năm 2021, đổi lấy 10% cổ phần cùng 2,5% cổ phần cố vấn; sau chương trình, trang mạng đạt kỷ lục khoảng 1 triệu lượt truy cập mỗi tháng (CafeBiz, 2021; Brands Vietnam, 2021).</w:t>
-      </w:r>
-    </w:p>
-    <w:p>
-      <w:pPr>
-        <w:pStyle w:val="ListBullet"/>
-        <w:jc w:val="both"/>
-      </w:pPr>
-      <w:r>
-        <w:t>Tăng doanh thu từ 39 tỷ đồng (2020) lên 363 tỷ đồng (2023) theo số liệu doanh nghiệp công bố (Coolmate, không ghi ngày-a).</w:t>
-      </w:r>
-    </w:p>
-    <w:p>
-      <w:pPr>
-        <w:pStyle w:val="ListBullet"/>
-        <w:jc w:val="both"/>
-      </w:pPr>
-      <w:r>
-        <w:t>Thuyết phục nhiều quỹ đầu tư qua các vòng: GSR Ventures (2022), Vertex Ventures và Kairous Capital (2024), Vertex Growth, Cool Japan Fund, YoungOne CVC (2025).</w:t>
-      </w:r>
-    </w:p>
-    <w:p>
-      <w:r>
-        <w:rPr>
-          <w:i/>
-          <w:color w:val="555555"/>
-          <w:sz w:val="21"/>
-        </w:rPr>
-        <w:t>Nguồn: CafeBiz. (2021, 4 tháng 5). Chân dung startup Coolmate vừa gọi vốn thành công 500.000 USD trên Shark Tank. https://cafebiz.vn/chan-dung-startup-coolmate-vua-goi-von-thanh-cong-500000-usd-tren-shark-tank-tung-di-thi-khoi-nghiep-chi-lot-top-10-nay-da-la-ong-trum-ban-chuc-nghin-don-tren-shopee-20210504091320202.chn</w:t>
-      </w:r>
-    </w:p>
-    <w:p>
-      <w:r>
-        <w:rPr>
-          <w:i/>
-          <w:color w:val="555555"/>
-          <w:sz w:val="21"/>
-        </w:rPr>
-        <w:t>Nguồn: Brands Vietnam. (2021). Sau Shark Tank, Coolmate đạt kỷ lục 1 triệu traffic/tháng. https://www.brandsvietnam.com/22165-Sau-Shark-Tank-Coolmate-dat-ky-luc-1-trieu-traffic-thang</w:t>
-      </w:r>
-    </w:p>
     <w:p>
       <w:r>
         <w:rPr>
@@ -3543,285 +3577,6 @@
       </w:r>
     </w:p>
     <w:p>
-      <w:r>
-        <w:rPr>
-          <w:i/>
-          <w:color w:val="555555"/>
-          <w:sz w:val="21"/>
-        </w:rPr>
-        <w:t>Nguồn: Brands Vietnam. (2022). Coolmate vừa nhận thêm 2,3 triệu USD cho vòng Series A từ GSR Ventures. https://www.brandsvietnam.com/23086-Coolmate-vua-nhan-them-2-3-trieu-USD-cho-vong-Series-A-tu-GSR-Ventures</w:t>
-      </w:r>
-    </w:p>
-    <w:p>
-      <w:r>
-        <w:rPr>
-          <w:i/>
-          <w:color w:val="555555"/>
-          <w:sz w:val="21"/>
-        </w:rPr>
-        <w:t>Nguồn: The Leader. (2024). Coolmate gọi vốn 6 triệu USD, tham vọng xuất hàng sang Mỹ. https://theleader.vn/coolmate-goi-von-6-trieu-usd-tham-vong-xuat-hang-sang-my-d37758.html</w:t>
-      </w:r>
-    </w:p>
-    <w:p>
-      <w:r>
-        <w:rPr>
-          <w:i/>
-          <w:color w:val="555555"/>
-          <w:sz w:val="21"/>
-        </w:rPr>
-        <w:t>Nguồn: Coolmate. (2025, ngày 3 tháng 11). Coolmate gọi vốn thành công vòng đầu tư tăng trưởng, mở ra chương mới cho thương hiệu Việt. https://www.coolmate.me/blog/coolmate-goi-von-thanh-cong-series-c-mo-ra-chuong-moi-cho-thuong-hieu-viet</w:t>
-      </w:r>
-    </w:p>
-    <w:p>
-      <w:pPr>
-        <w:jc w:val="center"/>
-      </w:pPr>
-      <w:r>
-        <w:rPr>
-          <w:b/>
-          <w:i/>
-        </w:rPr>
-        <w:t>Bảng 10. Doanh thu Coolmate giai đoạn 2020–2023</w:t>
-      </w:r>
-    </w:p>
-    <w:tbl>
-      <w:tblPr>
-        <w:tblStyle w:val="TableGrid"/>
-        <w:tblW w:type="auto" w:w="0"/>
-        <w:tblLook w:firstColumn="1" w:firstRow="1" w:lastColumn="0" w:lastRow="0" w:noHBand="0" w:noVBand="1" w:val="04A0"/>
-      </w:tblPr>
-      <w:tblGrid>
-        <w:gridCol w:w="2880"/>
-        <w:gridCol w:w="2880"/>
-        <w:gridCol w:w="2880"/>
-      </w:tblGrid>
-      <w:tr>
-        <w:tc>
-          <w:tcPr>
-            <w:tcW w:type="dxa" w:w="2880"/>
-            <w:shd w:val="clear" w:fill="1F3A60"/>
-          </w:tcPr>
-          <w:p>
-            <w:r>
-              <w:rPr>
-                <w:b/>
-                <w:color w:val="FFFFFF"/>
-                <w:sz w:val="23"/>
-              </w:rPr>
-              <w:t>Năm</w:t>
-            </w:r>
-          </w:p>
-        </w:tc>
-        <w:tc>
-          <w:tcPr>
-            <w:tcW w:type="dxa" w:w="2880"/>
-            <w:shd w:val="clear" w:fill="1F3A60"/>
-          </w:tcPr>
-          <w:p>
-            <w:r>
-              <w:rPr>
-                <w:b/>
-                <w:color w:val="FFFFFF"/>
-                <w:sz w:val="23"/>
-              </w:rPr>
-              <w:t>Doanh thu công bố</w:t>
-            </w:r>
-          </w:p>
-        </w:tc>
-        <w:tc>
-          <w:tcPr>
-            <w:tcW w:type="dxa" w:w="2880"/>
-            <w:shd w:val="clear" w:fill="1F3A60"/>
-          </w:tcPr>
-          <w:p>
-            <w:r>
-              <w:rPr>
-                <w:b/>
-                <w:color w:val="FFFFFF"/>
-                <w:sz w:val="23"/>
-              </w:rPr>
-              <w:t>Tăng so với năm trước (người viết tính)</w:t>
-            </w:r>
-          </w:p>
-        </w:tc>
-      </w:tr>
-      <w:tr>
-        <w:tc>
-          <w:tcPr>
-            <w:tcW w:type="dxa" w:w="2880"/>
-          </w:tcPr>
-          <w:p>
-            <w:r>
-              <w:rPr>
-                <w:sz w:val="23"/>
-              </w:rPr>
-              <w:t>2020</w:t>
-            </w:r>
-          </w:p>
-        </w:tc>
-        <w:tc>
-          <w:tcPr>
-            <w:tcW w:type="dxa" w:w="2880"/>
-          </w:tcPr>
-          <w:p>
-            <w:r>
-              <w:rPr>
-                <w:sz w:val="23"/>
-              </w:rPr>
-              <w:t>39 tỷ đồng</w:t>
-            </w:r>
-          </w:p>
-        </w:tc>
-        <w:tc>
-          <w:tcPr>
-            <w:tcW w:type="dxa" w:w="2880"/>
-          </w:tcPr>
-          <w:p>
-            <w:r>
-              <w:rPr>
-                <w:sz w:val="23"/>
-              </w:rPr>
-              <w:t>–</w:t>
-            </w:r>
-          </w:p>
-        </w:tc>
-      </w:tr>
-      <w:tr>
-        <w:tc>
-          <w:tcPr>
-            <w:tcW w:type="dxa" w:w="2880"/>
-          </w:tcPr>
-          <w:p>
-            <w:r>
-              <w:rPr>
-                <w:sz w:val="23"/>
-              </w:rPr>
-              <w:t>2021</w:t>
-            </w:r>
-          </w:p>
-        </w:tc>
-        <w:tc>
-          <w:tcPr>
-            <w:tcW w:type="dxa" w:w="2880"/>
-          </w:tcPr>
-          <w:p>
-            <w:r>
-              <w:rPr>
-                <w:sz w:val="23"/>
-              </w:rPr>
-              <w:t>137 tỷ đồng</w:t>
-            </w:r>
-          </w:p>
-        </w:tc>
-        <w:tc>
-          <w:tcPr>
-            <w:tcW w:type="dxa" w:w="2880"/>
-          </w:tcPr>
-          <w:p>
-            <w:r>
-              <w:rPr>
-                <w:sz w:val="23"/>
-              </w:rPr>
-              <w:t>Khoảng 251,3%</w:t>
-            </w:r>
-          </w:p>
-        </w:tc>
-      </w:tr>
-      <w:tr>
-        <w:tc>
-          <w:tcPr>
-            <w:tcW w:type="dxa" w:w="2880"/>
-          </w:tcPr>
-          <w:p>
-            <w:r>
-              <w:rPr>
-                <w:sz w:val="23"/>
-              </w:rPr>
-              <w:t>2022</w:t>
-            </w:r>
-          </w:p>
-        </w:tc>
-        <w:tc>
-          <w:tcPr>
-            <w:tcW w:type="dxa" w:w="2880"/>
-          </w:tcPr>
-          <w:p>
-            <w:r>
-              <w:rPr>
-                <w:sz w:val="23"/>
-              </w:rPr>
-              <w:t>292,8 tỷ đồng</w:t>
-            </w:r>
-          </w:p>
-        </w:tc>
-        <w:tc>
-          <w:tcPr>
-            <w:tcW w:type="dxa" w:w="2880"/>
-          </w:tcPr>
-          <w:p>
-            <w:r>
-              <w:rPr>
-                <w:sz w:val="23"/>
-              </w:rPr>
-              <w:t>Khoảng 113,7%</w:t>
-            </w:r>
-          </w:p>
-        </w:tc>
-      </w:tr>
-      <w:tr>
-        <w:tc>
-          <w:tcPr>
-            <w:tcW w:type="dxa" w:w="2880"/>
-          </w:tcPr>
-          <w:p>
-            <w:r>
-              <w:rPr>
-                <w:sz w:val="23"/>
-              </w:rPr>
-              <w:t>2023</w:t>
-            </w:r>
-          </w:p>
-        </w:tc>
-        <w:tc>
-          <w:tcPr>
-            <w:tcW w:type="dxa" w:w="2880"/>
-          </w:tcPr>
-          <w:p>
-            <w:r>
-              <w:rPr>
-                <w:sz w:val="23"/>
-              </w:rPr>
-              <w:t>363 tỷ đồng</w:t>
-            </w:r>
-          </w:p>
-        </w:tc>
-        <w:tc>
-          <w:tcPr>
-            <w:tcW w:type="dxa" w:w="2880"/>
-          </w:tcPr>
-          <w:p>
-            <w:r>
-              <w:rPr>
-                <w:sz w:val="23"/>
-              </w:rPr>
-              <w:t>Khoảng 24,0%</w:t>
-            </w:r>
-          </w:p>
-        </w:tc>
-      </w:tr>
-    </w:tbl>
-    <w:p/>
-    <w:p>
-      <w:r>
-        <w:rPr>
-          <w:i/>
-          <w:color w:val="555555"/>
-          <w:sz w:val="21"/>
-        </w:rPr>
-        <w:t>Nguồn: Coolmate. (không ghi ngày-a). Coolmate 101: Hành trình và các cột mốc phát triển. Truy cập ngày 10 tháng 10 năm 2026, tại https://www.coolmate.me/lp/coolmate-101</w:t>
-      </w:r>
-    </w:p>
-    <w:p>
       <w:pPr>
         <w:jc w:val="both"/>
       </w:pPr>
@@ -3963,7 +3718,7 @@
           <w:b/>
           <w:i/>
         </w:rPr>
-        <w:t>Bảng 11. Tăng trưởng của kênh thương mại điện tử</w:t>
+        <w:t>Bảng 10. Tăng trưởng của kênh thương mại điện tử</w:t>
       </w:r>
     </w:p>
     <w:tbl>
@@ -4499,7 +4254,7 @@
           <w:b/>
           <w:i/>
         </w:rPr>
-        <w:t>Bảng 12. So sánh tốc độ tăng trưởng các thị trường liên quan</w:t>
+        <w:t>Bảng 11. So sánh tốc độ tăng trưởng các thị trường liên quan</w:t>
       </w:r>
     </w:p>
     <w:tbl>
@@ -4800,7 +4555,7 @@
           <w:b/>
           <w:i/>
         </w:rPr>
-        <w:t>Bảng 13. Phân khúc thị trường của Coolmate</w:t>
+        <w:t>Bảng 12. Phân khúc thị trường của Coolmate</w:t>
       </w:r>
     </w:p>
     <w:tbl>
@@ -5180,7 +4935,7 @@
           <w:b/>
           <w:i/>
         </w:rPr>
-        <w:t>Bảng 14. Ước tính thị phần của Coolmate</w:t>
+        <w:t>Bảng 13. Ước tính thị phần của Coolmate</w:t>
       </w:r>
     </w:p>
     <w:tbl>
@@ -5431,7 +5186,7 @@
           <w:b/>
           <w:i/>
         </w:rPr>
-        <w:t>Bảng 15. Coolmate so với thị trường thời trang chính hãng trên sàn</w:t>
+        <w:t>Bảng 14. Coolmate so với thị trường thời trang chính hãng trên sàn</w:t>
       </w:r>
     </w:p>
     <w:tbl>
@@ -5609,7 +5364,7 @@
           <w:b/>
           <w:i/>
         </w:rPr>
-        <w:t>Bảng 16. Cơ cấu doanh số thương hiệu Coolmate trên các sàn</w:t>
+        <w:t>Bảng 15. Cơ cấu doanh số thương hiệu Coolmate trên các sàn</w:t>
       </w:r>
     </w:p>
     <w:tbl>
@@ -5783,7 +5538,7 @@
           <w:b/>
           <w:i/>
         </w:rPr>
-        <w:t>Bảng 17. Các đối thủ cạnh tranh chính</w:t>
+        <w:t>Bảng 16. Các đối thủ cạnh tranh chính</w:t>
       </w:r>
     </w:p>
     <w:tbl>
@@ -6221,7 +5976,7 @@
           <w:b/>
           <w:i/>
         </w:rPr>
-        <w:t>Bảng 18. Các vòng gọi vốn của Coolmate</w:t>
+        <w:t>Bảng 17. Các vòng gọi vốn của Coolmate</w:t>
       </w:r>
     </w:p>
     <w:tbl>
@@ -6613,7 +6368,7 @@
           <w:b/>
           <w:i/>
         </w:rPr>
-        <w:t>Bảng 19. Sự chuyển dịch kênh bán hàng</w:t>
+        <w:t>Bảng 18. Sự chuyển dịch kênh bán hàng</w:t>
       </w:r>
     </w:p>
     <w:tbl>
@@ -7074,7 +6829,7 @@
           <w:b/>
           <w:i/>
         </w:rPr>
-        <w:t>Bảng 20. Chuỗi sản xuất của Coolmate</w:t>
+        <w:t>Bảng 19. Chuỗi sản xuất của Coolmate</w:t>
       </w:r>
     </w:p>
     <w:tbl>
@@ -7427,7 +7182,7 @@
           <w:b/>
           <w:i/>
         </w:rPr>
-        <w:t>Bảng 21. Rủi ro vận hành</w:t>
+        <w:t>Bảng 20. Rủi ro vận hành</w:t>
       </w:r>
     </w:p>
     <w:tbl>
@@ -7839,7 +7594,7 @@
           <w:b/>
           <w:i/>
         </w:rPr>
-        <w:t>Bảng 22. Đánh giá năng lực quản trị</w:t>
+        <w:t>Bảng 21. Đánh giá năng lực quản trị</w:t>
       </w:r>
     </w:p>
     <w:tbl>
@@ -8139,7 +7894,7 @@
           <w:b/>
           <w:i/>
         </w:rPr>
-        <w:t>Bảng 23. Tổng hợp điểm theo chín yếu tố</w:t>
+        <w:t>Bảng 22. Tổng hợp điểm theo chín yếu tố</w:t>
       </w:r>
     </w:p>
     <w:tbl>
@@ -8239,7 +7994,7 @@
               <w:rPr>
                 <w:sz w:val="23"/>
               </w:rPr>
-              <w:t>Có dữ liệu khảo sát, thị trường chứng minh; khách nhạy cảm giá</w:t>
+              <w:t>Đồ mặc hằng ngày giá vừa túi tiền, chất lượng tin cậy, đổi trả dễ; khoảng 18 triệu khách nam tiềm năng</w:t>
             </w:r>
           </w:p>
         </w:tc>

</xml_diff>